<commit_message>
Added ChildRepo as submodule
</commit_message>
<xml_diff>
--- a/React/Notes/React notes.docx
+++ b/React/Notes/React notes.docx
@@ -4,18 +4,85 @@
   <w:body>
     <w:p>
       <w:pPr>
-        <w:pStyle w:val="ListParagraph"/>
-        <w:numPr>
-          <w:ilvl w:val="0"/>
-          <w:numId w:val="1"/>
-        </w:numPr>
-        <w:rPr>
-          <w:b/>
-          <w:bCs/>
-          <w:sz w:val="28"/>
-          <w:szCs w:val="28"/>
-        </w:rPr>
-      </w:pPr>
+        <w:ind w:left="360"/>
+        <w:rPr>
+          <w:b/>
+          <w:bCs/>
+          <w:sz w:val="28"/>
+          <w:szCs w:val="28"/>
+        </w:rPr>
+      </w:pPr>
+    </w:p>
+    <w:p>
+      <w:pPr>
+        <w:ind w:left="360"/>
+        <w:rPr>
+          <w:b/>
+          <w:bCs/>
+          <w:sz w:val="28"/>
+          <w:szCs w:val="28"/>
+        </w:rPr>
+      </w:pPr>
+      <w:r>
+        <w:rPr>
+          <w:b/>
+          <w:bCs/>
+          <w:sz w:val="28"/>
+          <w:szCs w:val="28"/>
+        </w:rPr>
+        <w:t xml:space="preserve">Remove-Item -Recurse -Force </w:t>
+      </w:r>
+      <w:proofErr w:type="spellStart"/>
+      <w:r>
+        <w:rPr>
+          <w:b/>
+          <w:bCs/>
+          <w:sz w:val="28"/>
+          <w:szCs w:val="28"/>
+        </w:rPr>
+        <w:t>node_modules</w:t>
+      </w:r>
+      <w:proofErr w:type="spellEnd"/>
+      <w:r>
+        <w:rPr>
+          <w:b/>
+          <w:bCs/>
+          <w:sz w:val="28"/>
+          <w:szCs w:val="28"/>
+        </w:rPr>
+        <w:t>; Remove-Item -Force package-</w:t>
+      </w:r>
+      <w:proofErr w:type="spellStart"/>
+      <w:r>
+        <w:rPr>
+          <w:b/>
+          <w:bCs/>
+          <w:sz w:val="28"/>
+          <w:szCs w:val="28"/>
+        </w:rPr>
+        <w:t>lock.json</w:t>
+      </w:r>
+      <w:proofErr w:type="spellEnd"/>
+    </w:p>
+    <w:p>
+      <w:pPr>
+        <w:ind w:left="360"/>
+        <w:rPr>
+          <w:b/>
+          <w:bCs/>
+          <w:sz w:val="28"/>
+          <w:szCs w:val="28"/>
+        </w:rPr>
+      </w:pPr>
+      <w:r>
+        <w:rPr>
+          <w:b/>
+          <w:bCs/>
+          <w:sz w:val="28"/>
+          <w:szCs w:val="28"/>
+        </w:rPr>
+        <w:t>1.</w:t>
+      </w:r>
       <w:r>
         <w:rPr>
           <w:b/>
@@ -48,7 +115,23 @@
           <w:sz w:val="28"/>
           <w:szCs w:val="28"/>
         </w:rPr>
-        <w:t xml:space="preserve">Ans: Js fundamentals, array, arrow fun implicit return, map, filter, reduce, object, mutable and immutable and DEstructuring </w:t>
+        <w:t xml:space="preserve">Ans: </w:t>
+      </w:r>
+      <w:proofErr w:type="spellStart"/>
+      <w:r>
+        <w:rPr>
+          <w:sz w:val="28"/>
+          <w:szCs w:val="28"/>
+        </w:rPr>
+        <w:t>Js</w:t>
+      </w:r>
+      <w:proofErr w:type="spellEnd"/>
+      <w:r>
+        <w:rPr>
+          <w:sz w:val="28"/>
+          <w:szCs w:val="28"/>
+        </w:rPr>
+        <w:t xml:space="preserve"> fundamentals, array, arrow fun implicit return, map, filter, reduce, object, mutable and immutable and DEstructuring </w:t>
       </w:r>
     </w:p>
     <w:p>
@@ -767,6 +850,7 @@
           <w:sz w:val="28"/>
           <w:szCs w:val="28"/>
         </w:rPr>
+        <w:lastRenderedPageBreak/>
         <w:t>anonymous: Requests script without cookies or authentication.</w:t>
       </w:r>
     </w:p>
@@ -786,7 +870,6 @@
           <w:sz w:val="28"/>
           <w:szCs w:val="28"/>
         </w:rPr>
-        <w:lastRenderedPageBreak/>
         <w:t>use-credentials: Requests script with cookies and authentication (server must allow it).</w:t>
       </w:r>
     </w:p>
@@ -1487,6 +1570,7 @@
           <w:sz w:val="28"/>
           <w:szCs w:val="28"/>
         </w:rPr>
+        <w:lastRenderedPageBreak/>
         <w:t>9.</w:t>
       </w:r>
       <w:r>
@@ -1520,7 +1604,6 @@
           <w:sz w:val="28"/>
           <w:szCs w:val="28"/>
         </w:rPr>
-        <w:lastRenderedPageBreak/>
         <w:t>Library</w:t>
       </w:r>
       <w:r>
@@ -1796,7 +1879,6 @@
         <w:t xml:space="preserve"> and </w:t>
       </w:r>
       <w:proofErr w:type="spellStart"/>
-      <w:proofErr w:type="gramStart"/>
       <w:r>
         <w:rPr>
           <w:rFonts w:ascii="Segoe UI Emoji" w:hAnsi="Segoe UI Emoji" w:cs="Segoe UI Emoji"/>
@@ -1808,7 +1890,6 @@
         <w:t>root.render</w:t>
       </w:r>
       <w:proofErr w:type="spellEnd"/>
-      <w:proofErr w:type="gramEnd"/>
     </w:p>
     <w:p>
       <w:pPr>
@@ -1876,7 +1957,6 @@
         <w:t xml:space="preserve"> element = </w:t>
       </w:r>
       <w:proofErr w:type="spellStart"/>
-      <w:proofErr w:type="gramStart"/>
       <w:r>
         <w:rPr>
           <w:rFonts w:ascii="Segoe UI Emoji" w:hAnsi="Segoe UI Emoji" w:cs="Segoe UI Emoji"/>
@@ -1892,34 +1972,95 @@
           <w:sz w:val="28"/>
           <w:szCs w:val="28"/>
         </w:rPr>
+        <w:t>(type, props, ...children)</w:t>
+      </w:r>
+    </w:p>
+    <w:p>
+      <w:pPr>
+        <w:rPr>
+          <w:rFonts w:ascii="Segoe UI Emoji" w:hAnsi="Segoe UI Emoji" w:cs="Segoe UI Emoji"/>
+          <w:sz w:val="28"/>
+          <w:szCs w:val="28"/>
+        </w:rPr>
+      </w:pPr>
+      <w:r>
+        <w:rPr>
+          <w:rFonts w:ascii="Segoe UI Emoji" w:hAnsi="Segoe UI Emoji" w:cs="Segoe UI Emoji"/>
+          <w:sz w:val="28"/>
+          <w:szCs w:val="28"/>
+        </w:rPr>
+        <w:t xml:space="preserve"> </w:t>
+      </w:r>
+      <w:proofErr w:type="spellStart"/>
+      <w:r>
+        <w:rPr>
+          <w:rFonts w:ascii="Segoe UI Emoji" w:hAnsi="Segoe UI Emoji" w:cs="Segoe UI Emoji"/>
+          <w:sz w:val="28"/>
+          <w:szCs w:val="28"/>
+        </w:rPr>
+        <w:t>createRoot</w:t>
+      </w:r>
+      <w:proofErr w:type="spellEnd"/>
+      <w:r>
+        <w:rPr>
+          <w:rFonts w:ascii="Segoe UI Emoji" w:hAnsi="Segoe UI Emoji" w:cs="Segoe UI Emoji"/>
+          <w:sz w:val="28"/>
+          <w:szCs w:val="28"/>
+        </w:rPr>
+        <w:t xml:space="preserve"> </w:t>
+      </w:r>
+      <w:r>
+        <w:rPr>
+          <w:rFonts w:ascii="Segoe UI Emoji" w:hAnsi="Segoe UI Emoji" w:cs="Segoe UI Emoji"/>
+          <w:sz w:val="28"/>
+          <w:szCs w:val="28"/>
+        </w:rPr>
+        <w:t>lets you create a root to display React components inside a browser DOM node.</w:t>
+      </w:r>
+      <w:r>
+        <w:rPr>
+          <w:rFonts w:ascii="Segoe UI Emoji" w:hAnsi="Segoe UI Emoji" w:cs="Segoe UI Emoji"/>
+          <w:sz w:val="28"/>
+          <w:szCs w:val="28"/>
+        </w:rPr>
+        <w:t xml:space="preserve"> </w:t>
+      </w:r>
+      <w:proofErr w:type="spellStart"/>
+      <w:r>
+        <w:rPr>
+          <w:rFonts w:ascii="Segoe UI Emoji" w:hAnsi="Segoe UI Emoji" w:cs="Segoe UI Emoji"/>
+          <w:sz w:val="28"/>
+          <w:szCs w:val="28"/>
+        </w:rPr>
+        <w:t>const</w:t>
+      </w:r>
+      <w:proofErr w:type="spellEnd"/>
+      <w:r>
+        <w:rPr>
+          <w:rFonts w:ascii="Segoe UI Emoji" w:hAnsi="Segoe UI Emoji" w:cs="Segoe UI Emoji"/>
+          <w:sz w:val="28"/>
+          <w:szCs w:val="28"/>
+        </w:rPr>
+        <w:t xml:space="preserve"> root = </w:t>
+      </w:r>
+      <w:proofErr w:type="spellStart"/>
+      <w:r>
+        <w:rPr>
+          <w:rFonts w:ascii="Segoe UI Emoji" w:hAnsi="Segoe UI Emoji" w:cs="Segoe UI Emoji"/>
+          <w:sz w:val="28"/>
+          <w:szCs w:val="28"/>
+        </w:rPr>
+        <w:t>createRoot</w:t>
+      </w:r>
+      <w:proofErr w:type="spellEnd"/>
+      <w:r>
+        <w:rPr>
+          <w:rFonts w:ascii="Segoe UI Emoji" w:hAnsi="Segoe UI Emoji" w:cs="Segoe UI Emoji"/>
+          <w:sz w:val="28"/>
+          <w:szCs w:val="28"/>
+        </w:rPr>
         <w:t>(</w:t>
       </w:r>
-      <w:proofErr w:type="gramEnd"/>
-      <w:r>
-        <w:rPr>
-          <w:rFonts w:ascii="Segoe UI Emoji" w:hAnsi="Segoe UI Emoji" w:cs="Segoe UI Emoji"/>
-          <w:sz w:val="28"/>
-          <w:szCs w:val="28"/>
-        </w:rPr>
-        <w:t>type, props, ...children)</w:t>
-      </w:r>
-    </w:p>
-    <w:p>
-      <w:pPr>
-        <w:rPr>
-          <w:rFonts w:ascii="Segoe UI Emoji" w:hAnsi="Segoe UI Emoji" w:cs="Segoe UI Emoji"/>
-          <w:sz w:val="28"/>
-          <w:szCs w:val="28"/>
-        </w:rPr>
-      </w:pPr>
-      <w:r>
-        <w:rPr>
-          <w:rFonts w:ascii="Segoe UI Emoji" w:hAnsi="Segoe UI Emoji" w:cs="Segoe UI Emoji"/>
-          <w:sz w:val="28"/>
-          <w:szCs w:val="28"/>
-        </w:rPr>
-        <w:t xml:space="preserve"> </w:t>
-      </w:r>
       <w:proofErr w:type="spellStart"/>
       <w:r>
         <w:rPr>
@@ -1927,7 +2068,7 @@
           <w:sz w:val="28"/>
           <w:szCs w:val="28"/>
         </w:rPr>
-        <w:t>createRoot</w:t>
+        <w:t>domNode</w:t>
       </w:r>
       <w:proofErr w:type="spellEnd"/>
       <w:r>
@@ -1936,23 +2077,32 @@
           <w:sz w:val="28"/>
           <w:szCs w:val="28"/>
         </w:rPr>
-        <w:t xml:space="preserve"> </w:t>
-      </w:r>
-      <w:r>
-        <w:rPr>
-          <w:rFonts w:ascii="Segoe UI Emoji" w:hAnsi="Segoe UI Emoji" w:cs="Segoe UI Emoji"/>
-          <w:sz w:val="28"/>
-          <w:szCs w:val="28"/>
-        </w:rPr>
-        <w:t>lets you create a root to display React components inside a browser DOM node.</w:t>
-      </w:r>
-      <w:r>
-        <w:rPr>
-          <w:rFonts w:ascii="Segoe UI Emoji" w:hAnsi="Segoe UI Emoji" w:cs="Segoe UI Emoji"/>
-          <w:sz w:val="28"/>
-          <w:szCs w:val="28"/>
-        </w:rPr>
-        <w:t xml:space="preserve"> </w:t>
+        <w:t>, options?)</w:t>
+      </w:r>
+    </w:p>
+    <w:p>
+      <w:pPr>
+        <w:rPr>
+          <w:rFonts w:ascii="Segoe UI Emoji" w:hAnsi="Segoe UI Emoji" w:cs="Segoe UI Emoji"/>
+          <w:sz w:val="28"/>
+          <w:szCs w:val="28"/>
+        </w:rPr>
+      </w:pPr>
+      <w:r>
+        <w:rPr>
+          <w:rFonts w:ascii="Segoe UI Emoji" w:hAnsi="Segoe UI Emoji" w:cs="Segoe UI Emoji"/>
+          <w:sz w:val="28"/>
+          <w:szCs w:val="28"/>
+        </w:rPr>
+        <w:t>render=</w:t>
+      </w:r>
+      <w:r>
+        <w:rPr>
+          <w:rFonts w:ascii="Segoe UI Emoji" w:hAnsi="Segoe UI Emoji" w:cs="Segoe UI Emoji"/>
+          <w:sz w:val="28"/>
+          <w:szCs w:val="28"/>
+        </w:rPr>
+        <w:t xml:space="preserve">Call </w:t>
       </w:r>
       <w:proofErr w:type="spellStart"/>
       <w:r>
@@ -1961,92 +2111,9 @@
           <w:sz w:val="28"/>
           <w:szCs w:val="28"/>
         </w:rPr>
-        <w:t>const</w:t>
+        <w:t>root.render</w:t>
       </w:r>
       <w:proofErr w:type="spellEnd"/>
-      <w:r>
-        <w:rPr>
-          <w:rFonts w:ascii="Segoe UI Emoji" w:hAnsi="Segoe UI Emoji" w:cs="Segoe UI Emoji"/>
-          <w:sz w:val="28"/>
-          <w:szCs w:val="28"/>
-        </w:rPr>
-        <w:t xml:space="preserve"> root = </w:t>
-      </w:r>
-      <w:proofErr w:type="spellStart"/>
-      <w:proofErr w:type="gramStart"/>
-      <w:r>
-        <w:rPr>
-          <w:rFonts w:ascii="Segoe UI Emoji" w:hAnsi="Segoe UI Emoji" w:cs="Segoe UI Emoji"/>
-          <w:sz w:val="28"/>
-          <w:szCs w:val="28"/>
-        </w:rPr>
-        <w:t>createRoot</w:t>
-      </w:r>
-      <w:proofErr w:type="spellEnd"/>
-      <w:r>
-        <w:rPr>
-          <w:rFonts w:ascii="Segoe UI Emoji" w:hAnsi="Segoe UI Emoji" w:cs="Segoe UI Emoji"/>
-          <w:sz w:val="28"/>
-          <w:szCs w:val="28"/>
-        </w:rPr>
-        <w:t>(</w:t>
-      </w:r>
-      <w:proofErr w:type="spellStart"/>
-      <w:proofErr w:type="gramEnd"/>
-      <w:r>
-        <w:rPr>
-          <w:rFonts w:ascii="Segoe UI Emoji" w:hAnsi="Segoe UI Emoji" w:cs="Segoe UI Emoji"/>
-          <w:sz w:val="28"/>
-          <w:szCs w:val="28"/>
-        </w:rPr>
-        <w:t>domNode</w:t>
-      </w:r>
-      <w:proofErr w:type="spellEnd"/>
-      <w:r>
-        <w:rPr>
-          <w:rFonts w:ascii="Segoe UI Emoji" w:hAnsi="Segoe UI Emoji" w:cs="Segoe UI Emoji"/>
-          <w:sz w:val="28"/>
-          <w:szCs w:val="28"/>
-        </w:rPr>
-        <w:t>, options?)</w:t>
-      </w:r>
-    </w:p>
-    <w:p>
-      <w:pPr>
-        <w:rPr>
-          <w:rFonts w:ascii="Segoe UI Emoji" w:hAnsi="Segoe UI Emoji" w:cs="Segoe UI Emoji"/>
-          <w:sz w:val="28"/>
-          <w:szCs w:val="28"/>
-        </w:rPr>
-      </w:pPr>
-      <w:r>
-        <w:rPr>
-          <w:rFonts w:ascii="Segoe UI Emoji" w:hAnsi="Segoe UI Emoji" w:cs="Segoe UI Emoji"/>
-          <w:sz w:val="28"/>
-          <w:szCs w:val="28"/>
-        </w:rPr>
-        <w:t>render=</w:t>
-      </w:r>
-      <w:r>
-        <w:rPr>
-          <w:rFonts w:ascii="Segoe UI Emoji" w:hAnsi="Segoe UI Emoji" w:cs="Segoe UI Emoji"/>
-          <w:sz w:val="28"/>
-          <w:szCs w:val="28"/>
-        </w:rPr>
-        <w:t xml:space="preserve">Call </w:t>
-      </w:r>
-      <w:proofErr w:type="spellStart"/>
-      <w:proofErr w:type="gramStart"/>
-      <w:r>
-        <w:rPr>
-          <w:rFonts w:ascii="Segoe UI Emoji" w:hAnsi="Segoe UI Emoji" w:cs="Segoe UI Emoji"/>
-          <w:sz w:val="28"/>
-          <w:szCs w:val="28"/>
-        </w:rPr>
-        <w:t>root.render</w:t>
-      </w:r>
-      <w:proofErr w:type="spellEnd"/>
-      <w:proofErr w:type="gramEnd"/>
       <w:r>
         <w:rPr>
           <w:rFonts w:ascii="Segoe UI Emoji" w:hAnsi="Segoe UI Emoji" w:cs="Segoe UI Emoji"/>
@@ -2432,6 +2499,7 @@
           <w:sz w:val="28"/>
           <w:szCs w:val="28"/>
         </w:rPr>
+        <w:lastRenderedPageBreak/>
         <w:t xml:space="preserve">1 is the normal – is used for production </w:t>
       </w:r>
     </w:p>
@@ -2449,7 +2517,6 @@
           <w:sz w:val="28"/>
           <w:szCs w:val="28"/>
         </w:rPr>
-        <w:lastRenderedPageBreak/>
         <w:t>..</w:t>
       </w:r>
     </w:p>
@@ -2470,7 +2537,6 @@
         <w:t xml:space="preserve">What is </w:t>
       </w:r>
       <w:proofErr w:type="spellStart"/>
-      <w:proofErr w:type="gramStart"/>
       <w:r>
         <w:rPr>
           <w:rFonts w:ascii="Segoe UI Emoji" w:hAnsi="Segoe UI Emoji" w:cs="Segoe UI Emoji"/>
@@ -2480,7 +2546,6 @@
         <w:t>package.json</w:t>
       </w:r>
       <w:proofErr w:type="spellEnd"/>
-      <w:proofErr w:type="gramEnd"/>
       <w:r>
         <w:rPr>
           <w:rFonts w:ascii="Segoe UI Emoji" w:hAnsi="Segoe UI Emoji" w:cs="Segoe UI Emoji"/>
@@ -2848,7 +2913,6 @@
         <w:t xml:space="preserve"> in git only I put </w:t>
       </w:r>
       <w:proofErr w:type="spellStart"/>
-      <w:proofErr w:type="gramStart"/>
       <w:r>
         <w:rPr>
           <w:rFonts w:ascii="Segoe UI Emoji" w:hAnsi="Segoe UI Emoji" w:cs="Segoe UI Emoji"/>
@@ -2860,7 +2924,6 @@
         <w:t>package.json</w:t>
       </w:r>
       <w:proofErr w:type="spellEnd"/>
-      <w:proofErr w:type="gramEnd"/>
       <w:r>
         <w:rPr>
           <w:rFonts w:ascii="Segoe UI Emoji" w:hAnsi="Segoe UI Emoji" w:cs="Segoe UI Emoji"/>
@@ -2892,7 +2955,6 @@
           <w:szCs w:val="28"/>
         </w:rPr>
       </w:pPr>
-      <w:proofErr w:type="gramStart"/>
       <w:r>
         <w:rPr>
           <w:rFonts w:ascii="Segoe UI Emoji" w:hAnsi="Segoe UI Emoji" w:cs="Segoe UI Emoji"/>
@@ -2901,7 +2963,6 @@
         </w:rPr>
         <w:t>A :</w:t>
       </w:r>
-      <w:proofErr w:type="gramEnd"/>
       <w:r>
         <w:rPr>
           <w:rFonts w:ascii="Times New Roman" w:eastAsia="Times New Roman" w:hAnsi="Times New Roman" w:cs="Times New Roman"/>
@@ -3267,6 +3328,7 @@
           <w:sz w:val="28"/>
           <w:szCs w:val="28"/>
         </w:rPr>
+        <w:lastRenderedPageBreak/>
         <w:t xml:space="preserve">Alternative: </w:t>
       </w:r>
       <w:r>
@@ -3306,7 +3368,6 @@
           <w:sz w:val="28"/>
           <w:szCs w:val="28"/>
         </w:rPr>
-        <w:lastRenderedPageBreak/>
         <w:t xml:space="preserve">How to initialize </w:t>
       </w:r>
       <w:proofErr w:type="spellStart"/>
@@ -3430,7 +3491,6 @@
         <w:t xml:space="preserve"> -y → Skips setup, auto-creates </w:t>
       </w:r>
       <w:proofErr w:type="spellStart"/>
-      <w:proofErr w:type="gramStart"/>
       <w:r>
         <w:rPr>
           <w:rFonts w:ascii="Segoe UI Emoji" w:hAnsi="Segoe UI Emoji" w:cs="Segoe UI Emoji"/>
@@ -3440,7 +3500,6 @@
         <w:t>package.json</w:t>
       </w:r>
       <w:proofErr w:type="spellEnd"/>
-      <w:proofErr w:type="gramEnd"/>
       <w:r>
         <w:rPr>
           <w:rFonts w:ascii="Segoe UI Emoji" w:hAnsi="Segoe UI Emoji" w:cs="Segoe UI Emoji"/>
@@ -3800,40 +3859,17 @@
           <w:sz w:val="28"/>
           <w:szCs w:val="28"/>
         </w:rPr>
-        <w:t xml:space="preserve">What is </w:t>
-      </w:r>
-      <w:proofErr w:type="gramStart"/>
-      <w:r>
-        <w:rPr>
-          <w:rFonts w:ascii="Segoe UI Emoji" w:hAnsi="Segoe UI Emoji" w:cs="Segoe UI Emoji"/>
-          <w:b/>
-          <w:bCs/>
-          <w:sz w:val="28"/>
-          <w:szCs w:val="28"/>
-        </w:rPr>
-        <w:t>the .parcel</w:t>
-      </w:r>
-      <w:proofErr w:type="gramEnd"/>
-      <w:r>
-        <w:rPr>
-          <w:rFonts w:ascii="Segoe UI Emoji" w:hAnsi="Segoe UI Emoji" w:cs="Segoe UI Emoji"/>
-          <w:b/>
-          <w:bCs/>
-          <w:sz w:val="28"/>
-          <w:szCs w:val="28"/>
-        </w:rPr>
-        <w:t>-cache folder?</w:t>
-      </w:r>
-    </w:p>
-    <w:p>
-      <w:pPr>
-        <w:rPr>
-          <w:rFonts w:ascii="Segoe UI Emoji" w:hAnsi="Segoe UI Emoji" w:cs="Segoe UI Emoji"/>
-          <w:sz w:val="28"/>
-          <w:szCs w:val="28"/>
-        </w:rPr>
-      </w:pPr>
-      <w:proofErr w:type="gramStart"/>
+        <w:t>What is the .parcel-cache folder?</w:t>
+      </w:r>
+    </w:p>
+    <w:p>
+      <w:pPr>
+        <w:rPr>
+          <w:rFonts w:ascii="Segoe UI Emoji" w:hAnsi="Segoe UI Emoji" w:cs="Segoe UI Emoji"/>
+          <w:sz w:val="28"/>
+          <w:szCs w:val="28"/>
+        </w:rPr>
+      </w:pPr>
       <w:r>
         <w:rPr>
           <w:rFonts w:ascii="Segoe UI Emoji" w:hAnsi="Segoe UI Emoji" w:cs="Segoe UI Emoji"/>
@@ -3850,18 +3886,7 @@
           <w:sz w:val="28"/>
           <w:szCs w:val="28"/>
         </w:rPr>
-        <w:t>.parcel</w:t>
-      </w:r>
-      <w:proofErr w:type="gramEnd"/>
-      <w:r>
-        <w:rPr>
-          <w:rFonts w:ascii="Segoe UI Emoji" w:hAnsi="Segoe UI Emoji" w:cs="Segoe UI Emoji"/>
-          <w:b/>
-          <w:bCs/>
-          <w:sz w:val="28"/>
-          <w:szCs w:val="28"/>
-        </w:rPr>
-        <w:t>-cache</w:t>
+        <w:t>.parcel-cache</w:t>
       </w:r>
       <w:r>
         <w:rPr>
@@ -3931,20 +3956,8 @@
           <w:sz w:val="28"/>
           <w:szCs w:val="28"/>
         </w:rPr>
-        <w:t xml:space="preserve">Speeds up </w:t>
-      </w:r>
-      <w:proofErr w:type="gramStart"/>
-      <w:r>
-        <w:rPr>
-          <w:rFonts w:ascii="Segoe UI Emoji" w:hAnsi="Segoe UI Emoji" w:cs="Segoe UI Emoji"/>
-          <w:b/>
-          <w:bCs/>
-          <w:sz w:val="28"/>
-          <w:szCs w:val="28"/>
-        </w:rPr>
-        <w:t>builds</w:t>
-      </w:r>
-      <w:proofErr w:type="gramEnd"/>
+        <w:t>Speeds up builds</w:t>
+      </w:r>
       <w:r>
         <w:rPr>
           <w:rFonts w:ascii="Segoe UI Emoji" w:hAnsi="Segoe UI Emoji" w:cs="Segoe UI Emoji"/>
@@ -4030,25 +4043,7 @@
           <w:sz w:val="28"/>
           <w:szCs w:val="28"/>
         </w:rPr>
-        <w:t xml:space="preserve">You can </w:t>
-      </w:r>
-      <w:proofErr w:type="gramStart"/>
-      <w:r>
-        <w:rPr>
-          <w:rFonts w:ascii="Segoe UI Emoji" w:hAnsi="Segoe UI Emoji" w:cs="Segoe UI Emoji"/>
-          <w:sz w:val="28"/>
-          <w:szCs w:val="28"/>
-        </w:rPr>
-        <w:t>delete .parcel</w:t>
-      </w:r>
-      <w:proofErr w:type="gramEnd"/>
-      <w:r>
-        <w:rPr>
-          <w:rFonts w:ascii="Segoe UI Emoji" w:hAnsi="Segoe UI Emoji" w:cs="Segoe UI Emoji"/>
-          <w:sz w:val="28"/>
-          <w:szCs w:val="28"/>
-        </w:rPr>
-        <w:t>-cache if needed; Parcel will regenerate it on the next build. 🚀</w:t>
+        <w:t>You can delete .parcel-cache if needed; Parcel will regenerate it on the next build. 🚀</w:t>
       </w:r>
     </w:p>
     <w:p>
@@ -4172,6 +4167,7 @@
           <w:sz w:val="28"/>
           <w:szCs w:val="28"/>
         </w:rPr>
+        <w:lastRenderedPageBreak/>
         <w:t xml:space="preserve">      </w:t>
       </w:r>
       <w:r>
@@ -4203,7 +4199,6 @@
           <w:sz w:val="28"/>
           <w:szCs w:val="28"/>
         </w:rPr>
-        <w:lastRenderedPageBreak/>
         <w:t>Reduces file size by optimizing the code further (e.g., renaming variables, removing redundant code).</w:t>
       </w:r>
     </w:p>
@@ -4682,28 +4677,9 @@
           <w:sz w:val="28"/>
           <w:szCs w:val="28"/>
         </w:rPr>
-        <w:t xml:space="preserve">A: </w:t>
-      </w:r>
-      <w:proofErr w:type="gramStart"/>
-      <w:r>
-        <w:rPr>
-          <w:rFonts w:ascii="Segoe UI Emoji" w:hAnsi="Segoe UI Emoji" w:cs="Segoe UI Emoji"/>
-          <w:sz w:val="28"/>
-          <w:szCs w:val="28"/>
-        </w:rPr>
-        <w:t>dependencies :</w:t>
-      </w:r>
-      <w:proofErr w:type="gramEnd"/>
-      <w:r>
-        <w:rPr>
-          <w:rFonts w:ascii="Segoe UI Emoji" w:hAnsi="Segoe UI Emoji" w:cs="Segoe UI Emoji"/>
-          <w:sz w:val="28"/>
-          <w:szCs w:val="28"/>
-        </w:rPr>
-        <w:t xml:space="preserve"> Packages required by your application in production. </w:t>
+        <w:t xml:space="preserve">A: dependencies : Packages required by your application in production. </w:t>
       </w:r>
       <w:proofErr w:type="spellStart"/>
-      <w:proofErr w:type="gramStart"/>
       <w:r>
         <w:rPr>
           <w:rFonts w:ascii="Segoe UI Emoji" w:hAnsi="Segoe UI Emoji" w:cs="Segoe UI Emoji"/>
@@ -4719,16 +4695,7 @@
           <w:sz w:val="28"/>
           <w:szCs w:val="28"/>
         </w:rPr>
-        <w:t xml:space="preserve"> :</w:t>
-      </w:r>
-      <w:proofErr w:type="gramEnd"/>
-      <w:r>
-        <w:rPr>
-          <w:rFonts w:ascii="Segoe UI Emoji" w:hAnsi="Segoe UI Emoji" w:cs="Segoe UI Emoji"/>
-          <w:sz w:val="28"/>
-          <w:szCs w:val="28"/>
-        </w:rPr>
-        <w:t xml:space="preserve"> Packages that are only needed for local development and testing.</w:t>
+        <w:t xml:space="preserve"> : Packages that are only needed for local development and testing.</w:t>
       </w:r>
     </w:p>
     <w:p>
@@ -4859,29 +4826,7 @@
           <w:sz w:val="28"/>
           <w:szCs w:val="28"/>
         </w:rPr>
-        <w:t xml:space="preserve">updates </w:t>
-      </w:r>
-      <w:proofErr w:type="gramStart"/>
-      <w:r>
-        <w:rPr>
-          <w:rFonts w:ascii="Segoe UI Emoji" w:hAnsi="Segoe UI Emoji" w:cs="Segoe UI Emoji"/>
-          <w:b/>
-          <w:bCs/>
-          <w:sz w:val="28"/>
-          <w:szCs w:val="28"/>
-        </w:rPr>
-        <w:t>changes</w:t>
-      </w:r>
-      <w:proofErr w:type="gramEnd"/>
-      <w:r>
-        <w:rPr>
-          <w:rFonts w:ascii="Segoe UI Emoji" w:hAnsi="Segoe UI Emoji" w:cs="Segoe UI Emoji"/>
-          <w:b/>
-          <w:bCs/>
-          <w:sz w:val="28"/>
-          <w:szCs w:val="28"/>
-        </w:rPr>
-        <w:t xml:space="preserve"> in your code without refreshing the entire page</w:t>
+        <w:t>updates changes in your code without refreshing the entire page</w:t>
       </w:r>
       <w:r>
         <w:rPr>
@@ -5844,18 +5789,7 @@
           <w:sz w:val="28"/>
           <w:szCs w:val="28"/>
         </w:rPr>
-        <w:t xml:space="preserve">: What </w:t>
-      </w:r>
-      <w:proofErr w:type="gramStart"/>
-      <w:r>
-        <w:rPr>
-          <w:rFonts w:ascii="Segoe UI Emoji" w:hAnsi="Segoe UI Emoji" w:cs="Segoe UI Emoji"/>
-          <w:b/>
-          <w:bCs/>
-          <w:sz w:val="28"/>
-          <w:szCs w:val="28"/>
-        </w:rPr>
-        <w:t>is .</w:t>
+        <w:t>: What is .</w:t>
       </w:r>
       <w:proofErr w:type="spellStart"/>
       <w:r>
@@ -5869,7 +5803,6 @@
         <w:t>gitignore</w:t>
       </w:r>
       <w:proofErr w:type="spellEnd"/>
-      <w:proofErr w:type="gramEnd"/>
       <w:r>
         <w:rPr>
           <w:rFonts w:ascii="Segoe UI Emoji" w:hAnsi="Segoe UI Emoji" w:cs="Segoe UI Emoji"/>
@@ -5897,18 +5830,7 @@
           <w:sz w:val="28"/>
           <w:szCs w:val="28"/>
         </w:rPr>
-        <w:t>A</w:t>
-      </w:r>
-      <w:proofErr w:type="gramStart"/>
-      <w:r>
-        <w:rPr>
-          <w:rFonts w:ascii="Segoe UI Emoji" w:hAnsi="Segoe UI Emoji" w:cs="Segoe UI Emoji"/>
-          <w:b/>
-          <w:bCs/>
-          <w:sz w:val="28"/>
-          <w:szCs w:val="28"/>
-        </w:rPr>
-        <w:t>:</w:t>
+        <w:t>A:</w:t>
       </w:r>
       <w:r>
         <w:rPr>
@@ -5928,7 +5850,6 @@
         <w:t>gitignore</w:t>
       </w:r>
       <w:proofErr w:type="spellEnd"/>
-      <w:proofErr w:type="gramEnd"/>
       <w:r>
         <w:rPr>
           <w:rFonts w:ascii="Segoe UI Emoji" w:hAnsi="Segoe UI Emoji" w:cs="Segoe UI Emoji"/>
@@ -5974,18 +5895,7 @@
           <w:sz w:val="28"/>
           <w:szCs w:val="28"/>
         </w:rPr>
-        <w:t xml:space="preserve">What Should You Add </w:t>
-      </w:r>
-      <w:proofErr w:type="gramStart"/>
-      <w:r>
-        <w:rPr>
-          <w:rFonts w:ascii="Segoe UI Emoji" w:hAnsi="Segoe UI Emoji" w:cs="Segoe UI Emoji"/>
-          <w:b/>
-          <w:bCs/>
-          <w:sz w:val="28"/>
-          <w:szCs w:val="28"/>
-        </w:rPr>
-        <w:t>to .</w:t>
+        <w:t>What Should You Add to .</w:t>
       </w:r>
       <w:proofErr w:type="spellStart"/>
       <w:r>
@@ -5999,7 +5909,6 @@
         <w:t>gitignore</w:t>
       </w:r>
       <w:proofErr w:type="spellEnd"/>
-      <w:proofErr w:type="gramEnd"/>
       <w:r>
         <w:rPr>
           <w:rFonts w:ascii="Segoe UI Emoji" w:hAnsi="Segoe UI Emoji" w:cs="Segoe UI Emoji"/>
@@ -6054,23 +5963,13 @@
           <w:szCs w:val="28"/>
         </w:rPr>
       </w:pPr>
-      <w:proofErr w:type="gramStart"/>
-      <w:r>
-        <w:rPr>
-          <w:rFonts w:ascii="Segoe UI Emoji" w:hAnsi="Segoe UI Emoji" w:cs="Segoe UI Emoji"/>
-          <w:sz w:val="28"/>
-          <w:szCs w:val="28"/>
-        </w:rPr>
-        <w:t>.parcel</w:t>
-      </w:r>
-      <w:proofErr w:type="gramEnd"/>
-      <w:r>
-        <w:rPr>
-          <w:rFonts w:ascii="Segoe UI Emoji" w:hAnsi="Segoe UI Emoji" w:cs="Segoe UI Emoji"/>
-          <w:sz w:val="28"/>
-          <w:szCs w:val="28"/>
-        </w:rPr>
-        <w:t>-cache/ → Parcel's build cache (not needed in Git).</w:t>
+      <w:r>
+        <w:rPr>
+          <w:rFonts w:ascii="Segoe UI Emoji" w:hAnsi="Segoe UI Emoji" w:cs="Segoe UI Emoji"/>
+          <w:sz w:val="28"/>
+          <w:szCs w:val="28"/>
+        </w:rPr>
+        <w:t>.parcel-cache/ → Parcel's build cache (not needed in Git).</w:t>
       </w:r>
     </w:p>
     <w:p>
@@ -6085,23 +5984,13 @@
           <w:szCs w:val="28"/>
         </w:rPr>
       </w:pPr>
-      <w:proofErr w:type="gramStart"/>
-      <w:r>
-        <w:rPr>
-          <w:rFonts w:ascii="Segoe UI Emoji" w:hAnsi="Segoe UI Emoji" w:cs="Segoe UI Emoji"/>
-          <w:sz w:val="28"/>
-          <w:szCs w:val="28"/>
-        </w:rPr>
-        <w:t>.env</w:t>
-      </w:r>
-      <w:proofErr w:type="gramEnd"/>
-      <w:r>
-        <w:rPr>
-          <w:rFonts w:ascii="Segoe UI Emoji" w:hAnsi="Segoe UI Emoji" w:cs="Segoe UI Emoji"/>
-          <w:sz w:val="28"/>
-          <w:szCs w:val="28"/>
-        </w:rPr>
-        <w:t xml:space="preserve"> → Environment variables (API keys, secrets).</w:t>
+      <w:r>
+        <w:rPr>
+          <w:rFonts w:ascii="Segoe UI Emoji" w:hAnsi="Segoe UI Emoji" w:cs="Segoe UI Emoji"/>
+          <w:sz w:val="28"/>
+          <w:szCs w:val="28"/>
+        </w:rPr>
+        <w:t>.env → Environment variables (API keys, secrets).</w:t>
       </w:r>
     </w:p>
     <w:p>
@@ -6196,7 +6085,6 @@
         <w:t xml:space="preserve">: What is the difference between </w:t>
       </w:r>
       <w:proofErr w:type="spellStart"/>
-      <w:proofErr w:type="gramStart"/>
       <w:r>
         <w:rPr>
           <w:rFonts w:ascii="Segoe UI Emoji" w:hAnsi="Segoe UI Emoji" w:cs="Segoe UI Emoji"/>
@@ -6208,7 +6096,6 @@
         <w:t>package.json</w:t>
       </w:r>
       <w:proofErr w:type="spellEnd"/>
-      <w:proofErr w:type="gramEnd"/>
       <w:r>
         <w:rPr>
           <w:rFonts w:ascii="Segoe UI Emoji" w:hAnsi="Segoe UI Emoji" w:cs="Segoe UI Emoji"/>
@@ -6251,7 +6138,6 @@
         </w:rPr>
       </w:pPr>
       <w:proofErr w:type="spellStart"/>
-      <w:proofErr w:type="gramStart"/>
       <w:r>
         <w:rPr>
           <w:rFonts w:ascii="Segoe UI Emoji" w:hAnsi="Segoe UI Emoji" w:cs="Segoe UI Emoji"/>
@@ -6263,7 +6149,6 @@
         <w:t>package.json</w:t>
       </w:r>
       <w:proofErr w:type="spellEnd"/>
-      <w:proofErr w:type="gramEnd"/>
       <w:r>
         <w:rPr>
           <w:rFonts w:ascii="Segoe UI Emoji" w:hAnsi="Segoe UI Emoji" w:cs="Segoe UI Emoji"/>
@@ -6292,7 +6177,6 @@
         <w:t>package-</w:t>
       </w:r>
       <w:proofErr w:type="spellStart"/>
-      <w:proofErr w:type="gramStart"/>
       <w:r>
         <w:rPr>
           <w:rFonts w:ascii="Segoe UI Emoji" w:hAnsi="Segoe UI Emoji" w:cs="Segoe UI Emoji"/>
@@ -6304,7 +6188,6 @@
         <w:t>lock.json</w:t>
       </w:r>
       <w:proofErr w:type="spellEnd"/>
-      <w:proofErr w:type="gramEnd"/>
       <w:r>
         <w:rPr>
           <w:rFonts w:ascii="Segoe UI Emoji" w:hAnsi="Segoe UI Emoji" w:cs="Segoe UI Emoji"/>
@@ -6332,7 +6215,6 @@
         <w:t xml:space="preserve">In short, </w:t>
       </w:r>
       <w:proofErr w:type="spellStart"/>
-      <w:proofErr w:type="gramStart"/>
       <w:r>
         <w:rPr>
           <w:rFonts w:ascii="Segoe UI Emoji" w:hAnsi="Segoe UI Emoji" w:cs="Segoe UI Emoji"/>
@@ -6342,7 +6224,6 @@
         <w:t>package.json</w:t>
       </w:r>
       <w:proofErr w:type="spellEnd"/>
-      <w:proofErr w:type="gramEnd"/>
       <w:r>
         <w:rPr>
           <w:rFonts w:ascii="Segoe UI Emoji" w:hAnsi="Segoe UI Emoji" w:cs="Segoe UI Emoji"/>
@@ -6410,7 +6291,6 @@
         <w:t>: Why should I not modify package-</w:t>
       </w:r>
       <w:proofErr w:type="spellStart"/>
-      <w:proofErr w:type="gramStart"/>
       <w:r>
         <w:rPr>
           <w:rFonts w:ascii="Segoe UI Emoji" w:hAnsi="Segoe UI Emoji" w:cs="Segoe UI Emoji"/>
@@ -6422,7 +6302,6 @@
         <w:t>lock.json</w:t>
       </w:r>
       <w:proofErr w:type="spellEnd"/>
-      <w:proofErr w:type="gramEnd"/>
       <w:r>
         <w:rPr>
           <w:rFonts w:ascii="Segoe UI Emoji" w:hAnsi="Segoe UI Emoji" w:cs="Segoe UI Emoji"/>
@@ -6451,7 +6330,6 @@
         <w:t>You should not manually modify package-</w:t>
       </w:r>
       <w:proofErr w:type="spellStart"/>
-      <w:proofErr w:type="gramStart"/>
       <w:r>
         <w:rPr>
           <w:rFonts w:ascii="Segoe UI Emoji" w:hAnsi="Segoe UI Emoji" w:cs="Segoe UI Emoji"/>
@@ -6461,7 +6339,6 @@
         <w:t>lock.json</w:t>
       </w:r>
       <w:proofErr w:type="spellEnd"/>
-      <w:proofErr w:type="gramEnd"/>
       <w:r>
         <w:rPr>
           <w:rFonts w:ascii="Segoe UI Emoji" w:hAnsi="Segoe UI Emoji" w:cs="Segoe UI Emoji"/>
@@ -6855,7 +6732,6 @@
         <w:t xml:space="preserve"> – Any dependencies listed in </w:t>
       </w:r>
       <w:proofErr w:type="spellStart"/>
-      <w:proofErr w:type="gramStart"/>
       <w:r>
         <w:rPr>
           <w:rFonts w:ascii="Segoe UI Emoji" w:hAnsi="Segoe UI Emoji" w:cs="Segoe UI Emoji"/>
@@ -6865,7 +6741,6 @@
         <w:t>package.json</w:t>
       </w:r>
       <w:proofErr w:type="spellEnd"/>
-      <w:proofErr w:type="gramEnd"/>
       <w:r>
         <w:rPr>
           <w:rFonts w:ascii="Segoe UI Emoji" w:hAnsi="Segoe UI Emoji" w:cs="Segoe UI Emoji"/>
@@ -7030,16 +6905,7 @@
           <w:sz w:val="28"/>
           <w:szCs w:val="28"/>
         </w:rPr>
-        <w:t xml:space="preserve"> install, so it's usually added </w:t>
-      </w:r>
-      <w:proofErr w:type="gramStart"/>
-      <w:r>
-        <w:rPr>
-          <w:rFonts w:ascii="Segoe UI Emoji" w:hAnsi="Segoe UI Emoji" w:cs="Segoe UI Emoji"/>
-          <w:sz w:val="28"/>
-          <w:szCs w:val="28"/>
-        </w:rPr>
-        <w:t>to .</w:t>
+        <w:t xml:space="preserve"> install, so it's usually added to .</w:t>
       </w:r>
       <w:proofErr w:type="spellStart"/>
       <w:r>
@@ -7051,7 +6917,6 @@
         <w:t>gitignore</w:t>
       </w:r>
       <w:proofErr w:type="spellEnd"/>
-      <w:proofErr w:type="gramEnd"/>
       <w:r>
         <w:rPr>
           <w:rFonts w:ascii="Segoe UI Emoji" w:hAnsi="Segoe UI Emoji" w:cs="Segoe UI Emoji"/>
@@ -7417,16 +7282,7 @@
           <w:sz w:val="28"/>
           <w:szCs w:val="28"/>
         </w:rPr>
-        <w:t xml:space="preserve"> run build), it’s usually added </w:t>
-      </w:r>
-      <w:proofErr w:type="gramStart"/>
-      <w:r>
-        <w:rPr>
-          <w:rFonts w:ascii="Segoe UI Emoji" w:hAnsi="Segoe UI Emoji" w:cs="Segoe UI Emoji"/>
-          <w:sz w:val="28"/>
-          <w:szCs w:val="28"/>
-        </w:rPr>
-        <w:t>to .</w:t>
+        <w:t xml:space="preserve"> run build), it’s usually added to .</w:t>
       </w:r>
       <w:proofErr w:type="spellStart"/>
       <w:r>
@@ -7438,7 +7294,6 @@
         <w:t>gitignore</w:t>
       </w:r>
       <w:proofErr w:type="spellEnd"/>
-      <w:proofErr w:type="gramEnd"/>
       <w:r>
         <w:rPr>
           <w:rFonts w:ascii="Segoe UI Emoji" w:hAnsi="Segoe UI Emoji" w:cs="Segoe UI Emoji"/>
@@ -8012,23 +7867,13 @@
         </w:rPr>
         <w:t xml:space="preserve"> </w:t>
       </w:r>
-      <w:proofErr w:type="gramStart"/>
-      <w:r>
-        <w:rPr>
-          <w:rFonts w:ascii="Segoe UI Emoji" w:hAnsi="Segoe UI Emoji" w:cs="Segoe UI Emoji"/>
-          <w:sz w:val="28"/>
-          <w:szCs w:val="28"/>
-        </w:rPr>
-        <w:t>  Modern</w:t>
-      </w:r>
-      <w:proofErr w:type="gramEnd"/>
-      <w:r>
-        <w:rPr>
-          <w:rFonts w:ascii="Segoe UI Emoji" w:hAnsi="Segoe UI Emoji" w:cs="Segoe UI Emoji"/>
-          <w:sz w:val="28"/>
-          <w:szCs w:val="28"/>
-        </w:rPr>
-        <w:t xml:space="preserve"> browsers assume JavaScript by default, so it's optional.</w:t>
+      <w:r>
+        <w:rPr>
+          <w:rFonts w:ascii="Segoe UI Emoji" w:hAnsi="Segoe UI Emoji" w:cs="Segoe UI Emoji"/>
+          <w:sz w:val="28"/>
+          <w:szCs w:val="28"/>
+        </w:rPr>
+        <w:t>  Modern browsers assume JavaScript by default, so it's optional.</w:t>
       </w:r>
     </w:p>
     <w:p>
@@ -8126,7 +7971,6 @@
         </w:rPr>
         <w:t xml:space="preserve">  </w:t>
       </w:r>
-      <w:proofErr w:type="gramStart"/>
       <w:r>
         <w:rPr>
           <w:rFonts w:ascii="Segoe UI Emoji" w:hAnsi="Segoe UI Emoji" w:cs="Segoe UI Emoji"/>
@@ -8153,18 +7997,7 @@
           <w:sz w:val="28"/>
           <w:szCs w:val="28"/>
         </w:rPr>
-        <w:t>type</w:t>
-      </w:r>
-      <w:proofErr w:type="gramEnd"/>
-      <w:r>
-        <w:rPr>
-          <w:rFonts w:ascii="Segoe UI Emoji" w:hAnsi="Segoe UI Emoji" w:cs="Segoe UI Emoji"/>
-          <w:b/>
-          <w:bCs/>
-          <w:sz w:val="28"/>
-          <w:szCs w:val="28"/>
-        </w:rPr>
-        <w:t>="application/</w:t>
+        <w:t>type="application/</w:t>
       </w:r>
       <w:proofErr w:type="spellStart"/>
       <w:r>
@@ -8221,7 +8054,6 @@
           <w:szCs w:val="28"/>
         </w:rPr>
       </w:pPr>
-      <w:proofErr w:type="gramStart"/>
       <w:r>
         <w:rPr>
           <w:rFonts w:ascii="Segoe UI Emoji" w:hAnsi="Segoe UI Emoji" w:cs="Segoe UI Emoji"/>
@@ -8232,7 +8064,6 @@
         </w:rPr>
         <w:t>4 .</w:t>
       </w:r>
-      <w:proofErr w:type="gramEnd"/>
       <w:r>
         <w:rPr>
           <w:rFonts w:ascii="Courier New" w:eastAsia="Times New Roman" w:hAnsi="Courier New" w:cs="Courier New"/>
@@ -8829,29 +8660,7 @@
           <w:sz w:val="28"/>
           <w:szCs w:val="28"/>
         </w:rPr>
-        <w:t>Arrow Functions (</w:t>
-      </w:r>
-      <w:proofErr w:type="gramStart"/>
-      <w:r>
-        <w:rPr>
-          <w:rFonts w:ascii="Segoe UI Emoji" w:hAnsi="Segoe UI Emoji" w:cs="Segoe UI Emoji"/>
-          <w:b/>
-          <w:bCs/>
-          <w:sz w:val="28"/>
-          <w:szCs w:val="28"/>
-        </w:rPr>
-        <w:t>()=</w:t>
-      </w:r>
-      <w:proofErr w:type="gramEnd"/>
-      <w:r>
-        <w:rPr>
-          <w:rFonts w:ascii="Segoe UI Emoji" w:hAnsi="Segoe UI Emoji" w:cs="Segoe UI Emoji"/>
-          <w:b/>
-          <w:bCs/>
-          <w:sz w:val="28"/>
-          <w:szCs w:val="28"/>
-        </w:rPr>
-        <w:t>&gt;{})</w:t>
+        <w:t>Arrow Functions (()=&gt;{})</w:t>
       </w:r>
       <w:r>
         <w:rPr>
@@ -11209,25 +11018,7 @@
           <w:szCs w:val="28"/>
         </w:rPr>
         <w:lastRenderedPageBreak/>
-        <w:t xml:space="preserve">  return &lt;h1&gt;Hello, {props.name</w:t>
-      </w:r>
-      <w:proofErr w:type="gramStart"/>
-      <w:r>
-        <w:rPr>
-          <w:rFonts w:ascii="Segoe UI Emoji" w:hAnsi="Segoe UI Emoji" w:cs="Segoe UI Emoji"/>
-          <w:sz w:val="28"/>
-          <w:szCs w:val="28"/>
-        </w:rPr>
-        <w:t>}!&lt;</w:t>
-      </w:r>
-      <w:proofErr w:type="gramEnd"/>
-      <w:r>
-        <w:rPr>
-          <w:rFonts w:ascii="Segoe UI Emoji" w:hAnsi="Segoe UI Emoji" w:cs="Segoe UI Emoji"/>
-          <w:sz w:val="28"/>
-          <w:szCs w:val="28"/>
-        </w:rPr>
-        <w:t>/h1&gt;;</w:t>
+        <w:t xml:space="preserve">  return &lt;h1&gt;Hello, {props.name}!&lt;/h1&gt;;</w:t>
       </w:r>
     </w:p>
     <w:p>
@@ -11448,25 +11239,7 @@
           <w:sz w:val="28"/>
           <w:szCs w:val="28"/>
         </w:rPr>
-        <w:t xml:space="preserve"> Greeting = </w:t>
-      </w:r>
-      <w:proofErr w:type="gramStart"/>
-      <w:r>
-        <w:rPr>
-          <w:rFonts w:ascii="Segoe UI Emoji" w:hAnsi="Segoe UI Emoji" w:cs="Segoe UI Emoji"/>
-          <w:sz w:val="28"/>
-          <w:szCs w:val="28"/>
-        </w:rPr>
-        <w:t>({ name</w:t>
-      </w:r>
-      <w:proofErr w:type="gramEnd"/>
-      <w:r>
-        <w:rPr>
-          <w:rFonts w:ascii="Segoe UI Emoji" w:hAnsi="Segoe UI Emoji" w:cs="Segoe UI Emoji"/>
-          <w:sz w:val="28"/>
-          <w:szCs w:val="28"/>
-        </w:rPr>
-        <w:t xml:space="preserve"> }) =&gt; &lt;h1&gt;Hello, {name}!&lt;/h1&gt;;</w:t>
+        <w:t xml:space="preserve"> Greeting = ({ name }) =&gt; &lt;h1&gt;Hello, {name}!&lt;/h1&gt;;</w:t>
       </w:r>
     </w:p>
     <w:p>
@@ -11585,25 +11358,7 @@
           <w:sz w:val="28"/>
           <w:szCs w:val="28"/>
         </w:rPr>
-        <w:t xml:space="preserve"> Greeting = </w:t>
-      </w:r>
-      <w:proofErr w:type="gramStart"/>
-      <w:r>
-        <w:rPr>
-          <w:rFonts w:ascii="Segoe UI Emoji" w:hAnsi="Segoe UI Emoji" w:cs="Segoe UI Emoji"/>
-          <w:sz w:val="28"/>
-          <w:szCs w:val="28"/>
-        </w:rPr>
-        <w:t>({ name</w:t>
-      </w:r>
-      <w:proofErr w:type="gramEnd"/>
-      <w:r>
-        <w:rPr>
-          <w:rFonts w:ascii="Segoe UI Emoji" w:hAnsi="Segoe UI Emoji" w:cs="Segoe UI Emoji"/>
-          <w:sz w:val="28"/>
-          <w:szCs w:val="28"/>
-        </w:rPr>
-        <w:t xml:space="preserve"> = "Guest" }) =&gt; &lt;h1&gt;Hello, {name}!&lt;/h1&gt;;</w:t>
+        <w:t xml:space="preserve"> Greeting = ({ name = "Guest" }) =&gt; &lt;h1&gt;Hello, {name}!&lt;/h1&gt;;</w:t>
       </w:r>
     </w:p>
     <w:p>
@@ -11705,60 +11460,24 @@
           <w:sz w:val="28"/>
           <w:szCs w:val="28"/>
         </w:rPr>
-        <w:t xml:space="preserve"> = </w:t>
-      </w:r>
-      <w:proofErr w:type="gramStart"/>
-      <w:r>
-        <w:rPr>
-          <w:rFonts w:ascii="Segoe UI Emoji" w:hAnsi="Segoe UI Emoji" w:cs="Segoe UI Emoji"/>
-          <w:sz w:val="28"/>
-          <w:szCs w:val="28"/>
-        </w:rPr>
-        <w:t>({ name</w:t>
-      </w:r>
-      <w:proofErr w:type="gramEnd"/>
-      <w:r>
-        <w:rPr>
-          <w:rFonts w:ascii="Segoe UI Emoji" w:hAnsi="Segoe UI Emoji" w:cs="Segoe UI Emoji"/>
-          <w:sz w:val="28"/>
-          <w:szCs w:val="28"/>
-        </w:rPr>
-        <w:t>, age }) =&gt; (</w:t>
-      </w:r>
-    </w:p>
-    <w:p>
-      <w:pPr>
-        <w:rPr>
-          <w:rFonts w:ascii="Segoe UI Emoji" w:hAnsi="Segoe UI Emoji" w:cs="Segoe UI Emoji"/>
-          <w:sz w:val="28"/>
-          <w:szCs w:val="28"/>
-        </w:rPr>
-      </w:pPr>
-      <w:r>
-        <w:rPr>
-          <w:rFonts w:ascii="Segoe UI Emoji" w:hAnsi="Segoe UI Emoji" w:cs="Segoe UI Emoji"/>
-          <w:sz w:val="28"/>
-          <w:szCs w:val="28"/>
-        </w:rPr>
-        <w:t xml:space="preserve">  &lt;p&gt;{name} is {age} years </w:t>
-      </w:r>
-      <w:proofErr w:type="gramStart"/>
-      <w:r>
-        <w:rPr>
-          <w:rFonts w:ascii="Segoe UI Emoji" w:hAnsi="Segoe UI Emoji" w:cs="Segoe UI Emoji"/>
-          <w:sz w:val="28"/>
-          <w:szCs w:val="28"/>
-        </w:rPr>
-        <w:t>old.&lt;</w:t>
-      </w:r>
-      <w:proofErr w:type="gramEnd"/>
-      <w:r>
-        <w:rPr>
-          <w:rFonts w:ascii="Segoe UI Emoji" w:hAnsi="Segoe UI Emoji" w:cs="Segoe UI Emoji"/>
-          <w:sz w:val="28"/>
-          <w:szCs w:val="28"/>
-        </w:rPr>
-        <w:t>/p&gt;</w:t>
+        <w:t xml:space="preserve"> = ({ name, age }) =&gt; (</w:t>
+      </w:r>
+    </w:p>
+    <w:p>
+      <w:pPr>
+        <w:rPr>
+          <w:rFonts w:ascii="Segoe UI Emoji" w:hAnsi="Segoe UI Emoji" w:cs="Segoe UI Emoji"/>
+          <w:sz w:val="28"/>
+          <w:szCs w:val="28"/>
+        </w:rPr>
+      </w:pPr>
+      <w:r>
+        <w:rPr>
+          <w:rFonts w:ascii="Segoe UI Emoji" w:hAnsi="Segoe UI Emoji" w:cs="Segoe UI Emoji"/>
+          <w:sz w:val="28"/>
+          <w:szCs w:val="28"/>
+        </w:rPr>
+        <w:t xml:space="preserve">  &lt;p&gt;{name} is {age} years old.&lt;/p&gt;</w:t>
       </w:r>
     </w:p>
     <w:p>
@@ -11820,25 +11539,7 @@
           <w:sz w:val="28"/>
           <w:szCs w:val="28"/>
         </w:rPr>
-        <w:t xml:space="preserve"> name="Bob" age</w:t>
-      </w:r>
-      <w:proofErr w:type="gramStart"/>
-      <w:r>
-        <w:rPr>
-          <w:rFonts w:ascii="Segoe UI Emoji" w:hAnsi="Segoe UI Emoji" w:cs="Segoe UI Emoji"/>
-          <w:sz w:val="28"/>
-          <w:szCs w:val="28"/>
-        </w:rPr>
-        <w:t>={</w:t>
-      </w:r>
-      <w:proofErr w:type="gramEnd"/>
-      <w:r>
-        <w:rPr>
-          <w:rFonts w:ascii="Segoe UI Emoji" w:hAnsi="Segoe UI Emoji" w:cs="Segoe UI Emoji"/>
-          <w:sz w:val="28"/>
-          <w:szCs w:val="28"/>
-        </w:rPr>
-        <w:t>25} /&gt;;</w:t>
+        <w:t xml:space="preserve"> name="Bob" age={25} /&gt;;</w:t>
       </w:r>
     </w:p>
     <w:p>
@@ -11939,25 +11640,7 @@
           <w:sz w:val="28"/>
           <w:szCs w:val="28"/>
         </w:rPr>
-        <w:t xml:space="preserve"> user = </w:t>
-      </w:r>
-      <w:proofErr w:type="gramStart"/>
-      <w:r>
-        <w:rPr>
-          <w:rFonts w:ascii="Segoe UI Emoji" w:hAnsi="Segoe UI Emoji" w:cs="Segoe UI Emoji"/>
-          <w:sz w:val="28"/>
-          <w:szCs w:val="28"/>
-        </w:rPr>
-        <w:t>{ name</w:t>
-      </w:r>
-      <w:proofErr w:type="gramEnd"/>
-      <w:r>
-        <w:rPr>
-          <w:rFonts w:ascii="Segoe UI Emoji" w:hAnsi="Segoe UI Emoji" w:cs="Segoe UI Emoji"/>
-          <w:sz w:val="28"/>
-          <w:szCs w:val="28"/>
-        </w:rPr>
-        <w:t>: "Charlie", age: 30 };</w:t>
+        <w:t xml:space="preserve"> user = { name: "Charlie", age: 30 };</w:t>
       </w:r>
     </w:p>
     <w:p>
@@ -12003,25 +11686,7 @@
           <w:sz w:val="28"/>
           <w:szCs w:val="28"/>
         </w:rPr>
-        <w:t xml:space="preserve"> = </w:t>
-      </w:r>
-      <w:proofErr w:type="gramStart"/>
-      <w:r>
-        <w:rPr>
-          <w:rFonts w:ascii="Segoe UI Emoji" w:hAnsi="Segoe UI Emoji" w:cs="Segoe UI Emoji"/>
-          <w:sz w:val="28"/>
-          <w:szCs w:val="28"/>
-        </w:rPr>
-        <w:t>({ user</w:t>
-      </w:r>
-      <w:proofErr w:type="gramEnd"/>
-      <w:r>
-        <w:rPr>
-          <w:rFonts w:ascii="Segoe UI Emoji" w:hAnsi="Segoe UI Emoji" w:cs="Segoe UI Emoji"/>
-          <w:sz w:val="28"/>
-          <w:szCs w:val="28"/>
-        </w:rPr>
-        <w:t xml:space="preserve"> }) =&gt; (</w:t>
+        <w:t xml:space="preserve"> = ({ user }) =&gt; (</w:t>
       </w:r>
     </w:p>
     <w:p>
@@ -12056,25 +11721,7 @@
           <w:sz w:val="28"/>
           <w:szCs w:val="28"/>
         </w:rPr>
-        <w:t xml:space="preserve">} years </w:t>
-      </w:r>
-      <w:proofErr w:type="gramStart"/>
-      <w:r>
-        <w:rPr>
-          <w:rFonts w:ascii="Segoe UI Emoji" w:hAnsi="Segoe UI Emoji" w:cs="Segoe UI Emoji"/>
-          <w:sz w:val="28"/>
-          <w:szCs w:val="28"/>
-        </w:rPr>
-        <w:t>old.&lt;</w:t>
-      </w:r>
-      <w:proofErr w:type="gramEnd"/>
-      <w:r>
-        <w:rPr>
-          <w:rFonts w:ascii="Segoe UI Emoji" w:hAnsi="Segoe UI Emoji" w:cs="Segoe UI Emoji"/>
-          <w:sz w:val="28"/>
-          <w:szCs w:val="28"/>
-        </w:rPr>
-        <w:t>/p&gt;</w:t>
+        <w:t>} years old.&lt;/p&gt;</w:t>
       </w:r>
     </w:p>
     <w:p>
@@ -12255,16 +11902,7 @@
           <w:sz w:val="28"/>
           <w:szCs w:val="28"/>
         </w:rPr>
-        <w:t xml:space="preserve"> Button = </w:t>
-      </w:r>
-      <w:proofErr w:type="gramStart"/>
-      <w:r>
-        <w:rPr>
-          <w:rFonts w:ascii="Segoe UI Emoji" w:hAnsi="Segoe UI Emoji" w:cs="Segoe UI Emoji"/>
-          <w:sz w:val="28"/>
-          <w:szCs w:val="28"/>
-        </w:rPr>
-        <w:t xml:space="preserve">({ </w:t>
+        <w:t xml:space="preserve"> Button = ({ </w:t>
       </w:r>
       <w:proofErr w:type="spellStart"/>
       <w:r>
@@ -12276,7 +11914,6 @@
         <w:t>handleClick</w:t>
       </w:r>
       <w:proofErr w:type="spellEnd"/>
-      <w:proofErr w:type="gramEnd"/>
       <w:r>
         <w:rPr>
           <w:rFonts w:ascii="Segoe UI Emoji" w:hAnsi="Segoe UI Emoji" w:cs="Segoe UI Emoji"/>
@@ -12433,25 +12070,7 @@
           <w:sz w:val="28"/>
           <w:szCs w:val="28"/>
         </w:rPr>
-        <w:t xml:space="preserve"> = () =&gt; </w:t>
-      </w:r>
-      <w:proofErr w:type="gramStart"/>
-      <w:r>
-        <w:rPr>
-          <w:rFonts w:ascii="Segoe UI Emoji" w:hAnsi="Segoe UI Emoji" w:cs="Segoe UI Emoji"/>
-          <w:sz w:val="28"/>
-          <w:szCs w:val="28"/>
-        </w:rPr>
-        <w:t>alert(</w:t>
-      </w:r>
-      <w:proofErr w:type="gramEnd"/>
-      <w:r>
-        <w:rPr>
-          <w:rFonts w:ascii="Segoe UI Emoji" w:hAnsi="Segoe UI Emoji" w:cs="Segoe UI Emoji"/>
-          <w:sz w:val="28"/>
-          <w:szCs w:val="28"/>
-        </w:rPr>
-        <w:t>"Button Clicked!");</w:t>
+        <w:t xml:space="preserve"> = () =&gt; alert("Button Clicked!");</w:t>
       </w:r>
     </w:p>
     <w:p>
@@ -13024,7 +12643,6 @@
         </w:rPr>
       </w:pPr>
       <w:proofErr w:type="spellStart"/>
-      <w:proofErr w:type="gramStart"/>
       <w:r>
         <w:rPr>
           <w:rFonts w:ascii="Segoe UI Emoji" w:hAnsi="Segoe UI Emoji" w:cs="Segoe UI Emoji"/>
@@ -13034,7 +12652,6 @@
         <w:t>document.getElementById</w:t>
       </w:r>
       <w:proofErr w:type="spellEnd"/>
-      <w:proofErr w:type="gramEnd"/>
       <w:r>
         <w:rPr>
           <w:rFonts w:ascii="Segoe UI Emoji" w:hAnsi="Segoe UI Emoji" w:cs="Segoe UI Emoji"/>
@@ -13352,25 +12969,7 @@
           <w:sz w:val="28"/>
           <w:szCs w:val="28"/>
         </w:rPr>
-        <w:t xml:space="preserve">      &lt;h1&gt;Count: {count}&lt;/h1&gt; {/* Only </w:t>
-      </w:r>
-      <w:proofErr w:type="gramStart"/>
-      <w:r>
-        <w:rPr>
-          <w:rFonts w:ascii="Segoe UI Emoji" w:hAnsi="Segoe UI Emoji" w:cs="Segoe UI Emoji"/>
-          <w:sz w:val="28"/>
-          <w:szCs w:val="28"/>
-        </w:rPr>
-        <w:t>this updates</w:t>
-      </w:r>
-      <w:proofErr w:type="gramEnd"/>
-      <w:r>
-        <w:rPr>
-          <w:rFonts w:ascii="Segoe UI Emoji" w:hAnsi="Segoe UI Emoji" w:cs="Segoe UI Emoji"/>
-          <w:sz w:val="28"/>
-          <w:szCs w:val="28"/>
-        </w:rPr>
-        <w:t>, not the entire UI */}</w:t>
+        <w:t xml:space="preserve">      &lt;h1&gt;Count: {count}&lt;/h1&gt; {/* Only this updates, not the entire UI */}</w:t>
       </w:r>
     </w:p>
     <w:p>
@@ -13400,23 +12999,13 @@
         <w:t>onClick</w:t>
       </w:r>
       <w:proofErr w:type="spellEnd"/>
-      <w:proofErr w:type="gramStart"/>
-      <w:r>
-        <w:rPr>
-          <w:rFonts w:ascii="Segoe UI Emoji" w:hAnsi="Segoe UI Emoji" w:cs="Segoe UI Emoji"/>
-          <w:sz w:val="28"/>
-          <w:szCs w:val="28"/>
-        </w:rPr>
-        <w:t>={</w:t>
-      </w:r>
-      <w:proofErr w:type="gramEnd"/>
-      <w:r>
-        <w:rPr>
-          <w:rFonts w:ascii="Segoe UI Emoji" w:hAnsi="Segoe UI Emoji" w:cs="Segoe UI Emoji"/>
-          <w:sz w:val="28"/>
-          <w:szCs w:val="28"/>
-        </w:rPr>
-        <w:t xml:space="preserve">() =&gt; </w:t>
+      <w:r>
+        <w:rPr>
+          <w:rFonts w:ascii="Segoe UI Emoji" w:hAnsi="Segoe UI Emoji" w:cs="Segoe UI Emoji"/>
+          <w:sz w:val="28"/>
+          <w:szCs w:val="28"/>
+        </w:rPr>
+        <w:t xml:space="preserve">={() =&gt; </w:t>
       </w:r>
       <w:proofErr w:type="spellStart"/>
       <w:r>
@@ -13629,36 +13218,16 @@
           <w:sz w:val="28"/>
           <w:szCs w:val="28"/>
         </w:rPr>
-        <w:t>38.</w:t>
-      </w:r>
-      <w:proofErr w:type="gramStart"/>
-      <w:r>
-        <w:rPr>
-          <w:b/>
-          <w:bCs/>
-          <w:sz w:val="28"/>
-          <w:szCs w:val="28"/>
-        </w:rPr>
-        <w:t>React</w:t>
-      </w:r>
-      <w:r>
-        <w:rPr>
-          <w:b/>
-          <w:bCs/>
-          <w:sz w:val="28"/>
-          <w:szCs w:val="28"/>
-        </w:rPr>
-        <w:t>(</w:t>
-      </w:r>
-      <w:proofErr w:type="gramEnd"/>
-      <w:r>
-        <w:rPr>
-          <w:b/>
-          <w:bCs/>
-          <w:sz w:val="28"/>
-          <w:szCs w:val="28"/>
-        </w:rPr>
-        <w:t>or JavaScript in general), there are three main types of exports:</w:t>
+        <w:t>38.React</w:t>
+      </w:r>
+      <w:r>
+        <w:rPr>
+          <w:b/>
+          <w:bCs/>
+          <w:sz w:val="28"/>
+          <w:szCs w:val="28"/>
+        </w:rPr>
+        <w:t>(or JavaScript in general), there are three main types of exports:</w:t>
       </w:r>
     </w:p>
     <w:p>
@@ -13825,23 +13394,7 @@
           <w:sz w:val="24"/>
           <w:szCs w:val="24"/>
         </w:rPr>
-        <w:t xml:space="preserve">import </w:t>
-      </w:r>
-      <w:proofErr w:type="gramStart"/>
-      <w:r>
-        <w:rPr>
-          <w:sz w:val="24"/>
-          <w:szCs w:val="24"/>
-        </w:rPr>
-        <w:t>{ hello</w:t>
-      </w:r>
-      <w:proofErr w:type="gramEnd"/>
-      <w:r>
-        <w:rPr>
-          <w:sz w:val="24"/>
-          <w:szCs w:val="24"/>
-        </w:rPr>
-        <w:t>, goodbye } from "./file";</w:t>
+        <w:t>import { hello, goodbye } from "./file";</w:t>
       </w:r>
     </w:p>
     <w:p>
@@ -13938,23 +13491,7 @@
           <w:sz w:val="24"/>
           <w:szCs w:val="24"/>
         </w:rPr>
-        <w:t xml:space="preserve">export default function </w:t>
-      </w:r>
-      <w:proofErr w:type="gramStart"/>
-      <w:r>
-        <w:rPr>
-          <w:sz w:val="24"/>
-          <w:szCs w:val="24"/>
-        </w:rPr>
-        <w:t>greet(</w:t>
-      </w:r>
-      <w:proofErr w:type="gramEnd"/>
-      <w:r>
-        <w:rPr>
-          <w:sz w:val="24"/>
-          <w:szCs w:val="24"/>
-        </w:rPr>
-        <w:t>) {</w:t>
+        <w:t>export default function greet() {</w:t>
       </w:r>
     </w:p>
     <w:p>
@@ -13992,23 +13529,7 @@
           <w:sz w:val="24"/>
           <w:szCs w:val="24"/>
         </w:rPr>
-        <w:t xml:space="preserve">import greet from </w:t>
-      </w:r>
-      <w:proofErr w:type="gramStart"/>
-      <w:r>
-        <w:rPr>
-          <w:sz w:val="24"/>
-          <w:szCs w:val="24"/>
-        </w:rPr>
-        <w:t>"./</w:t>
-      </w:r>
-      <w:proofErr w:type="gramEnd"/>
-      <w:r>
-        <w:rPr>
-          <w:sz w:val="24"/>
-          <w:szCs w:val="24"/>
-        </w:rPr>
-        <w:t>file"; // Can be any name</w:t>
+        <w:t>import greet from "./file"; // Can be any name</w:t>
       </w:r>
     </w:p>
     <w:p>
@@ -14029,19 +13550,8 @@
           <w:sz w:val="24"/>
           <w:szCs w:val="24"/>
         </w:rPr>
-        <w:t xml:space="preserve">* as Export (export * as &amp; import * </w:t>
-      </w:r>
-      <w:proofErr w:type="gramStart"/>
-      <w:r>
-        <w:rPr>
-          <w:b/>
-          <w:bCs/>
-          <w:sz w:val="24"/>
-          <w:szCs w:val="24"/>
-        </w:rPr>
-        <w:t>as )</w:t>
-      </w:r>
-      <w:proofErr w:type="gramEnd"/>
+        <w:t>* as Export (export * as &amp; import * as )</w:t>
+      </w:r>
     </w:p>
     <w:p>
       <w:pPr>
@@ -14187,23 +13697,7 @@
           <w:sz w:val="24"/>
           <w:szCs w:val="24"/>
         </w:rPr>
-        <w:t xml:space="preserve">import * as messages from </w:t>
-      </w:r>
-      <w:proofErr w:type="gramStart"/>
-      <w:r>
-        <w:rPr>
-          <w:sz w:val="24"/>
-          <w:szCs w:val="24"/>
-        </w:rPr>
-        <w:t>"./</w:t>
-      </w:r>
-      <w:proofErr w:type="gramEnd"/>
-      <w:r>
-        <w:rPr>
-          <w:sz w:val="24"/>
-          <w:szCs w:val="24"/>
-        </w:rPr>
-        <w:t>file";</w:t>
+        <w:t>import * as messages from "./file";</w:t>
       </w:r>
     </w:p>
     <w:p>
@@ -14218,7 +13712,6 @@
         </w:rPr>
       </w:pPr>
       <w:proofErr w:type="spellStart"/>
-      <w:proofErr w:type="gramStart"/>
       <w:r>
         <w:rPr>
           <w:sz w:val="24"/>
@@ -14227,7 +13720,6 @@
         <w:t>messages.hello</w:t>
       </w:r>
       <w:proofErr w:type="spellEnd"/>
-      <w:proofErr w:type="gramEnd"/>
       <w:r>
         <w:rPr>
           <w:sz w:val="24"/>
@@ -14248,7 +13740,6 @@
         </w:rPr>
       </w:pPr>
       <w:proofErr w:type="spellStart"/>
-      <w:proofErr w:type="gramStart"/>
       <w:r>
         <w:rPr>
           <w:sz w:val="24"/>
@@ -14257,7 +13748,6 @@
         <w:t>messages.goodbye</w:t>
       </w:r>
       <w:proofErr w:type="spellEnd"/>
-      <w:proofErr w:type="gramEnd"/>
       <w:r>
         <w:rPr>
           <w:sz w:val="24"/>
@@ -16584,7 +16074,6 @@
         <w:t xml:space="preserve"> = await </w:t>
       </w:r>
       <w:proofErr w:type="spellStart"/>
-      <w:proofErr w:type="gramStart"/>
       <w:r>
         <w:rPr>
           <w:b/>
@@ -16595,7 +16084,6 @@
         <w:t>data.json</w:t>
       </w:r>
       <w:proofErr w:type="spellEnd"/>
-      <w:proofErr w:type="gramEnd"/>
       <w:r>
         <w:rPr>
           <w:b/>
@@ -16747,7 +16235,6 @@
         <w:br/>
         <w:t>2️</w:t>
       </w:r>
-      <w:proofErr w:type="gramStart"/>
       <w:r>
         <w:rPr>
           <w:rFonts w:ascii="Segoe UI Symbol" w:hAnsi="Segoe UI Symbol" w:cs="Segoe UI Symbol"/>
@@ -16772,7 +16259,6 @@
         <w:t>json</w:t>
       </w:r>
       <w:proofErr w:type="spellEnd"/>
-      <w:proofErr w:type="gramEnd"/>
       <w:r>
         <w:rPr>
           <w:sz w:val="24"/>
@@ -16908,27 +16394,7 @@
                 <w:sz w:val="24"/>
                 <w:szCs w:val="24"/>
               </w:rPr>
-              <w:t xml:space="preserve">What are various ways to add images into </w:t>
-            </w:r>
-            <w:proofErr w:type="gramStart"/>
-            <w:r>
-              <w:rPr>
-                <w:b/>
-                <w:bCs/>
-                <w:sz w:val="24"/>
-                <w:szCs w:val="24"/>
-              </w:rPr>
-              <w:t>our</w:t>
-            </w:r>
-            <w:proofErr w:type="gramEnd"/>
-            <w:r>
-              <w:rPr>
-                <w:b/>
-                <w:bCs/>
-                <w:sz w:val="24"/>
-                <w:szCs w:val="24"/>
-              </w:rPr>
-              <w:t xml:space="preserve"> react project? Explain simple answer with code examples.</w:t>
+              <w:t>What are various ways to add images into our react project? Explain simple answer with code examples.</w:t>
             </w:r>
           </w:p>
         </w:tc>
@@ -17515,27 +16981,7 @@
                 <w:sz w:val="24"/>
                 <w:szCs w:val="24"/>
               </w:rPr>
-              <w:t xml:space="preserve"> </w:t>
-            </w:r>
-            <w:proofErr w:type="gramStart"/>
-            <w:r>
-              <w:rPr>
-                <w:b/>
-                <w:bCs/>
-                <w:sz w:val="24"/>
-                <w:szCs w:val="24"/>
-              </w:rPr>
-              <w:t>props</w:t>
-            </w:r>
-            <w:proofErr w:type="gramEnd"/>
-            <w:r>
-              <w:rPr>
-                <w:b/>
-                <w:bCs/>
-                <w:sz w:val="24"/>
-                <w:szCs w:val="24"/>
-              </w:rPr>
-              <w:t xml:space="preserve"> se change </w:t>
+              <w:t xml:space="preserve"> props se change </w:t>
             </w:r>
             <w:proofErr w:type="spellStart"/>
             <w:r>
@@ -17614,58 +17060,22 @@
           <w:sz w:val="24"/>
           <w:szCs w:val="24"/>
         </w:rPr>
-        <w:t>What would happen if we do console.log(</w:t>
-      </w:r>
-      <w:proofErr w:type="gramStart"/>
-      <w:r>
-        <w:rPr>
-          <w:b/>
-          <w:bCs/>
-          <w:sz w:val="24"/>
-          <w:szCs w:val="24"/>
-        </w:rPr>
-        <w:t>useState(</w:t>
-      </w:r>
-      <w:proofErr w:type="gramEnd"/>
-      <w:r>
-        <w:rPr>
-          <w:b/>
-          <w:bCs/>
-          <w:sz w:val="24"/>
-          <w:szCs w:val="24"/>
-        </w:rPr>
-        <w:t>))?</w:t>
-      </w:r>
-    </w:p>
-    <w:p>
-      <w:pPr>
-        <w:rPr>
-          <w:sz w:val="24"/>
-          <w:szCs w:val="24"/>
-        </w:rPr>
-      </w:pPr>
-      <w:r>
-        <w:rPr>
-          <w:sz w:val="24"/>
-          <w:szCs w:val="24"/>
-        </w:rPr>
-        <w:t>A: If we do console.log(</w:t>
-      </w:r>
-      <w:proofErr w:type="gramStart"/>
-      <w:r>
-        <w:rPr>
-          <w:sz w:val="24"/>
-          <w:szCs w:val="24"/>
-        </w:rPr>
-        <w:t>useState(</w:t>
-      </w:r>
-      <w:proofErr w:type="gramEnd"/>
-      <w:r>
-        <w:rPr>
-          <w:sz w:val="24"/>
-          <w:szCs w:val="24"/>
-        </w:rPr>
-        <w:t>)), we get an array [undefined, function] where first item in an array is state is undefined and the second item in an array is setState function is bound dispatchSetState.</w:t>
+        <w:t>What would happen if we do console.log(useState())?</w:t>
+      </w:r>
+    </w:p>
+    <w:p>
+      <w:pPr>
+        <w:rPr>
+          <w:sz w:val="24"/>
+          <w:szCs w:val="24"/>
+        </w:rPr>
+      </w:pPr>
+      <w:r>
+        <w:rPr>
+          <w:sz w:val="24"/>
+          <w:szCs w:val="24"/>
+        </w:rPr>
+        <w:t>A: If we do console.log(useState()), we get an array [undefined, function] where first item in an array is state is undefined and the second item in an array is setState function is bound dispatchSetState.</w:t>
       </w:r>
     </w:p>
     <w:p>
@@ -17747,114 +17157,57 @@
         </w:rPr>
         <w:t xml:space="preserve">         </w:t>
       </w:r>
-      <w:proofErr w:type="gramStart"/>
-      <w:r>
-        <w:rPr>
-          <w:sz w:val="24"/>
-          <w:szCs w:val="24"/>
-        </w:rPr>
-        <w:t>useEffect(</w:t>
-      </w:r>
-      <w:proofErr w:type="gramEnd"/>
-      <w:r>
-        <w:rPr>
-          <w:sz w:val="24"/>
-          <w:szCs w:val="24"/>
-        </w:rPr>
-        <w:t>() =&gt; {}, []);</w:t>
-      </w:r>
-    </w:p>
-    <w:p>
-      <w:pPr>
-        <w:rPr>
-          <w:sz w:val="24"/>
-          <w:szCs w:val="24"/>
-        </w:rPr>
-      </w:pPr>
-      <w:r>
-        <w:rPr>
-          <w:sz w:val="24"/>
-          <w:szCs w:val="24"/>
-        </w:rPr>
-        <w:t xml:space="preserve">Case </w:t>
-      </w:r>
-      <w:proofErr w:type="gramStart"/>
-      <w:r>
-        <w:rPr>
-          <w:sz w:val="24"/>
-          <w:szCs w:val="24"/>
-        </w:rPr>
-        <w:t>1 :</w:t>
-      </w:r>
-      <w:proofErr w:type="gramEnd"/>
-      <w:r>
-        <w:rPr>
-          <w:sz w:val="24"/>
-          <w:szCs w:val="24"/>
-        </w:rPr>
-        <w:t xml:space="preserve"> When the dependency array is not included in the arguments of useEffect() hook, the callback function will be executed every time the component is rendered and re-rendered.</w:t>
-      </w:r>
-    </w:p>
-    <w:p>
-      <w:pPr>
-        <w:rPr>
-          <w:sz w:val="24"/>
-          <w:szCs w:val="24"/>
-        </w:rPr>
-      </w:pPr>
-      <w:r>
-        <w:rPr>
-          <w:sz w:val="24"/>
-          <w:szCs w:val="24"/>
-        </w:rPr>
-        <w:t xml:space="preserve">Case </w:t>
-      </w:r>
-      <w:proofErr w:type="gramStart"/>
-      <w:r>
-        <w:rPr>
-          <w:sz w:val="24"/>
-          <w:szCs w:val="24"/>
-        </w:rPr>
-        <w:t>2 :</w:t>
-      </w:r>
-      <w:proofErr w:type="gramEnd"/>
-      <w:r>
-        <w:rPr>
-          <w:sz w:val="24"/>
-          <w:szCs w:val="24"/>
-        </w:rPr>
-        <w:t xml:space="preserve"> When the dependency array is empty in the arguments of useEffect() hook, the callback function will be executed only one time during the initial render of the component.</w:t>
-      </w:r>
-    </w:p>
-    <w:p>
-      <w:pPr>
-        <w:rPr>
-          <w:sz w:val="24"/>
-          <w:szCs w:val="24"/>
-        </w:rPr>
-      </w:pPr>
-      <w:r>
-        <w:rPr>
-          <w:sz w:val="24"/>
-          <w:szCs w:val="24"/>
-        </w:rPr>
-        <w:t xml:space="preserve">Case </w:t>
-      </w:r>
-      <w:proofErr w:type="gramStart"/>
-      <w:r>
-        <w:rPr>
-          <w:sz w:val="24"/>
-          <w:szCs w:val="24"/>
-        </w:rPr>
-        <w:t>3 :</w:t>
-      </w:r>
-      <w:proofErr w:type="gramEnd"/>
-      <w:r>
-        <w:rPr>
-          <w:sz w:val="24"/>
-          <w:szCs w:val="24"/>
-        </w:rPr>
-        <w:t xml:space="preserve"> When the dependency array contains a condition, the callback function will be executed one time during the initial render of the component and also re</w:t>
+      <w:r>
+        <w:rPr>
+          <w:sz w:val="24"/>
+          <w:szCs w:val="24"/>
+        </w:rPr>
+        <w:t>useEffect(() =&gt; {}, []);</w:t>
+      </w:r>
+    </w:p>
+    <w:p>
+      <w:pPr>
+        <w:rPr>
+          <w:sz w:val="24"/>
+          <w:szCs w:val="24"/>
+        </w:rPr>
+      </w:pPr>
+      <w:r>
+        <w:rPr>
+          <w:sz w:val="24"/>
+          <w:szCs w:val="24"/>
+        </w:rPr>
+        <w:t>Case 1 : When the dependency array is not included in the arguments of useEffect() hook, the callback function will be executed every time the component is rendered and re-rendered.</w:t>
+      </w:r>
+    </w:p>
+    <w:p>
+      <w:pPr>
+        <w:rPr>
+          <w:sz w:val="24"/>
+          <w:szCs w:val="24"/>
+        </w:rPr>
+      </w:pPr>
+      <w:r>
+        <w:rPr>
+          <w:sz w:val="24"/>
+          <w:szCs w:val="24"/>
+        </w:rPr>
+        <w:t>Case 2 : When the dependency array is empty in the arguments of useEffect() hook, the callback function will be executed only one time during the initial render of the component.</w:t>
+      </w:r>
+    </w:p>
+    <w:p>
+      <w:pPr>
+        <w:rPr>
+          <w:sz w:val="24"/>
+          <w:szCs w:val="24"/>
+        </w:rPr>
+      </w:pPr>
+      <w:r>
+        <w:rPr>
+          <w:sz w:val="24"/>
+          <w:szCs w:val="24"/>
+        </w:rPr>
+        <w:t>Case 3 : When the dependency array contains a condition, the callback function will be executed one time during the initial render of the component and also re</w:t>
       </w:r>
       <w:r>
         <w:rPr>
@@ -18059,17 +17412,7 @@
           <w:sz w:val="24"/>
           <w:szCs w:val="24"/>
         </w:rPr>
-        <w:t>2</w:t>
-      </w:r>
-      <w:proofErr w:type="gramStart"/>
-      <w:r>
-        <w:rPr>
-          <w:b/>
-          <w:bCs/>
-          <w:sz w:val="24"/>
-          <w:szCs w:val="24"/>
-        </w:rPr>
-        <w:t>️</w:t>
+        <w:t>2️</w:t>
       </w:r>
       <w:r>
         <w:rPr>
@@ -18088,17 +17431,7 @@
           <w:sz w:val="24"/>
           <w:szCs w:val="24"/>
         </w:rPr>
-        <w:t>Client</w:t>
-      </w:r>
-      <w:proofErr w:type="gramEnd"/>
-      <w:r>
-        <w:rPr>
-          <w:b/>
-          <w:bCs/>
-          <w:sz w:val="24"/>
-          <w:szCs w:val="24"/>
-        </w:rPr>
-        <w:t>-Side Routing (CSR):</w:t>
+        <w:t>Client-Side Routing (CSR):</w:t>
       </w:r>
       <w:r>
         <w:rPr>
@@ -18345,21 +17678,12 @@
           <w:szCs w:val="24"/>
         </w:rPr>
       </w:pPr>
-      <w:proofErr w:type="gramStart"/>
-      <w:r>
-        <w:rPr>
-          <w:sz w:val="24"/>
-          <w:szCs w:val="24"/>
-        </w:rPr>
-        <w:t>constructor(</w:t>
-      </w:r>
-      <w:proofErr w:type="gramEnd"/>
-      <w:r>
-        <w:rPr>
-          <w:sz w:val="24"/>
-          <w:szCs w:val="24"/>
-        </w:rPr>
-        <w:t>)</w:t>
+      <w:r>
+        <w:rPr>
+          <w:sz w:val="24"/>
+          <w:szCs w:val="24"/>
+        </w:rPr>
+        <w:t>constructor()</w:t>
       </w:r>
     </w:p>
     <w:p>
@@ -18392,21 +17716,12 @@
           <w:szCs w:val="24"/>
         </w:rPr>
       </w:pPr>
-      <w:proofErr w:type="gramStart"/>
-      <w:r>
-        <w:rPr>
-          <w:sz w:val="24"/>
-          <w:szCs w:val="24"/>
-        </w:rPr>
-        <w:t>componentDidMount(</w:t>
-      </w:r>
-      <w:proofErr w:type="gramEnd"/>
-      <w:r>
-        <w:rPr>
-          <w:sz w:val="24"/>
-          <w:szCs w:val="24"/>
-        </w:rPr>
-        <w:t>)</w:t>
+      <w:r>
+        <w:rPr>
+          <w:sz w:val="24"/>
+          <w:szCs w:val="24"/>
+        </w:rPr>
+        <w:t>componentDidMount()</w:t>
       </w:r>
     </w:p>
     <w:p>
@@ -18420,21 +17735,12 @@
           <w:szCs w:val="24"/>
         </w:rPr>
       </w:pPr>
-      <w:proofErr w:type="gramStart"/>
-      <w:r>
-        <w:rPr>
-          <w:sz w:val="24"/>
-          <w:szCs w:val="24"/>
-        </w:rPr>
-        <w:t>componentDidUpdate(</w:t>
-      </w:r>
-      <w:proofErr w:type="gramEnd"/>
-      <w:r>
-        <w:rPr>
-          <w:sz w:val="24"/>
-          <w:szCs w:val="24"/>
-        </w:rPr>
-        <w:t>)</w:t>
+      <w:r>
+        <w:rPr>
+          <w:sz w:val="24"/>
+          <w:szCs w:val="24"/>
+        </w:rPr>
+        <w:t>componentDidUpdate()</w:t>
       </w:r>
     </w:p>
     <w:p>
@@ -18448,21 +17754,12 @@
           <w:szCs w:val="24"/>
         </w:rPr>
       </w:pPr>
-      <w:proofErr w:type="gramStart"/>
-      <w:r>
-        <w:rPr>
-          <w:sz w:val="24"/>
-          <w:szCs w:val="24"/>
-        </w:rPr>
-        <w:t>componentWillUnmount(</w:t>
-      </w:r>
-      <w:proofErr w:type="gramEnd"/>
-      <w:r>
-        <w:rPr>
-          <w:sz w:val="24"/>
-          <w:szCs w:val="24"/>
-        </w:rPr>
-        <w:t>)</w:t>
+      <w:r>
+        <w:rPr>
+          <w:sz w:val="24"/>
+          <w:szCs w:val="24"/>
+        </w:rPr>
+        <w:t>componentWillUnmount()</w:t>
       </w:r>
     </w:p>
     <w:p>
@@ -18514,79 +17811,41 @@
           <w:sz w:val="24"/>
           <w:szCs w:val="24"/>
         </w:rPr>
-        <w:t xml:space="preserve">57. </w:t>
-      </w:r>
-      <w:r>
-        <w:rPr>
-          <w:b/>
-          <w:bCs/>
-          <w:sz w:val="24"/>
-          <w:szCs w:val="24"/>
-        </w:rPr>
-        <w:t xml:space="preserve"> Why do we use componentDidMount? </w:t>
-      </w:r>
-    </w:p>
-    <w:p>
-      <w:pPr>
-        <w:rPr>
-          <w:b/>
-          <w:bCs/>
-          <w:sz w:val="24"/>
-          <w:szCs w:val="24"/>
-        </w:rPr>
-      </w:pPr>
-      <w:r>
-        <w:rPr>
-          <w:b/>
-          <w:bCs/>
-          <w:sz w:val="24"/>
-          <w:szCs w:val="24"/>
-        </w:rPr>
-        <w:t xml:space="preserve">Why Do We Use </w:t>
-      </w:r>
-      <w:proofErr w:type="gramStart"/>
-      <w:r>
-        <w:rPr>
-          <w:b/>
-          <w:bCs/>
-          <w:sz w:val="24"/>
-          <w:szCs w:val="24"/>
-        </w:rPr>
-        <w:t>componentDidMount(</w:t>
-      </w:r>
-      <w:proofErr w:type="gramEnd"/>
-      <w:r>
-        <w:rPr>
-          <w:b/>
-          <w:bCs/>
-          <w:sz w:val="24"/>
-          <w:szCs w:val="24"/>
-        </w:rPr>
-        <w:t>)?</w:t>
-      </w:r>
-    </w:p>
-    <w:p>
-      <w:pPr>
-        <w:rPr>
-          <w:sz w:val="24"/>
-          <w:szCs w:val="24"/>
-        </w:rPr>
-      </w:pPr>
-      <w:proofErr w:type="gramStart"/>
-      <w:r>
-        <w:rPr>
-          <w:sz w:val="24"/>
-          <w:szCs w:val="24"/>
-        </w:rPr>
-        <w:t>componentDidMount(</w:t>
-      </w:r>
-      <w:proofErr w:type="gramEnd"/>
-      <w:r>
-        <w:rPr>
-          <w:sz w:val="24"/>
-          <w:szCs w:val="24"/>
-        </w:rPr>
-        <w:t xml:space="preserve">) is a lifecycle method in </w:t>
+        <w:t xml:space="preserve">57.  Why do we use componentDidMount? </w:t>
+      </w:r>
+    </w:p>
+    <w:p>
+      <w:pPr>
+        <w:rPr>
+          <w:b/>
+          <w:bCs/>
+          <w:sz w:val="24"/>
+          <w:szCs w:val="24"/>
+        </w:rPr>
+      </w:pPr>
+      <w:r>
+        <w:rPr>
+          <w:b/>
+          <w:bCs/>
+          <w:sz w:val="24"/>
+          <w:szCs w:val="24"/>
+        </w:rPr>
+        <w:t>Why Do We Use componentDidMount()?</w:t>
+      </w:r>
+    </w:p>
+    <w:p>
+      <w:pPr>
+        <w:rPr>
+          <w:sz w:val="24"/>
+          <w:szCs w:val="24"/>
+        </w:rPr>
+      </w:pPr>
+      <w:r>
+        <w:rPr>
+          <w:sz w:val="24"/>
+          <w:szCs w:val="24"/>
+        </w:rPr>
+        <w:t xml:space="preserve">componentDidMount() is a lifecycle method in </w:t>
       </w:r>
       <w:r>
         <w:rPr>
@@ -18637,27 +17896,7 @@
           <w:sz w:val="24"/>
           <w:szCs w:val="24"/>
         </w:rPr>
-        <w:t xml:space="preserve">Uses of </w:t>
-      </w:r>
-      <w:proofErr w:type="gramStart"/>
-      <w:r>
-        <w:rPr>
-          <w:b/>
-          <w:bCs/>
-          <w:sz w:val="24"/>
-          <w:szCs w:val="24"/>
-        </w:rPr>
-        <w:t>componentDidMount(</w:t>
-      </w:r>
-      <w:proofErr w:type="gramEnd"/>
-      <w:r>
-        <w:rPr>
-          <w:b/>
-          <w:bCs/>
-          <w:sz w:val="24"/>
-          <w:szCs w:val="24"/>
-        </w:rPr>
-        <w:t>)</w:t>
+        <w:t>Uses of componentDidMount()</w:t>
       </w:r>
     </w:p>
     <w:p>
@@ -18716,7 +17955,6 @@
         <w:t xml:space="preserve"> – Used to attach event listeners like </w:t>
       </w:r>
       <w:proofErr w:type="spellStart"/>
-      <w:proofErr w:type="gramStart"/>
       <w:r>
         <w:rPr>
           <w:sz w:val="24"/>
@@ -18725,7 +17963,6 @@
         <w:t>window.addEventListener</w:t>
       </w:r>
       <w:proofErr w:type="spellEnd"/>
-      <w:proofErr w:type="gramEnd"/>
       <w:r>
         <w:rPr>
           <w:sz w:val="24"/>
@@ -18830,79 +18067,41 @@
           <w:sz w:val="24"/>
           <w:szCs w:val="24"/>
         </w:rPr>
-        <w:t>58</w:t>
-      </w:r>
-      <w:r>
-        <w:rPr>
-          <w:b/>
-          <w:bCs/>
-          <w:sz w:val="24"/>
-          <w:szCs w:val="24"/>
-        </w:rPr>
-        <w:t xml:space="preserve">: Why do we use componentWillUnmount? Show with example. </w:t>
-      </w:r>
-    </w:p>
-    <w:p>
-      <w:pPr>
-        <w:rPr>
-          <w:b/>
-          <w:bCs/>
-          <w:sz w:val="24"/>
-          <w:szCs w:val="24"/>
-        </w:rPr>
-      </w:pPr>
-      <w:r>
-        <w:rPr>
-          <w:b/>
-          <w:bCs/>
-          <w:sz w:val="24"/>
-          <w:szCs w:val="24"/>
-        </w:rPr>
-        <w:t xml:space="preserve">Why Do We Use </w:t>
-      </w:r>
-      <w:proofErr w:type="gramStart"/>
-      <w:r>
-        <w:rPr>
-          <w:b/>
-          <w:bCs/>
-          <w:sz w:val="24"/>
-          <w:szCs w:val="24"/>
-        </w:rPr>
-        <w:t>componentWillUnmount(</w:t>
-      </w:r>
-      <w:proofErr w:type="gramEnd"/>
-      <w:r>
-        <w:rPr>
-          <w:b/>
-          <w:bCs/>
-          <w:sz w:val="24"/>
-          <w:szCs w:val="24"/>
-        </w:rPr>
-        <w:t>)?</w:t>
-      </w:r>
-    </w:p>
-    <w:p>
-      <w:pPr>
-        <w:rPr>
-          <w:sz w:val="24"/>
-          <w:szCs w:val="24"/>
-        </w:rPr>
-      </w:pPr>
-      <w:proofErr w:type="gramStart"/>
-      <w:r>
-        <w:rPr>
-          <w:sz w:val="24"/>
-          <w:szCs w:val="24"/>
-        </w:rPr>
-        <w:t>componentWillUnmount(</w:t>
-      </w:r>
-      <w:proofErr w:type="gramEnd"/>
-      <w:r>
-        <w:rPr>
-          <w:sz w:val="24"/>
-          <w:szCs w:val="24"/>
-        </w:rPr>
-        <w:t xml:space="preserve">) is a lifecycle method in </w:t>
+        <w:t xml:space="preserve">58: Why do we use componentWillUnmount? Show with example. </w:t>
+      </w:r>
+    </w:p>
+    <w:p>
+      <w:pPr>
+        <w:rPr>
+          <w:b/>
+          <w:bCs/>
+          <w:sz w:val="24"/>
+          <w:szCs w:val="24"/>
+        </w:rPr>
+      </w:pPr>
+      <w:r>
+        <w:rPr>
+          <w:b/>
+          <w:bCs/>
+          <w:sz w:val="24"/>
+          <w:szCs w:val="24"/>
+        </w:rPr>
+        <w:t>Why Do We Use componentWillUnmount()?</w:t>
+      </w:r>
+    </w:p>
+    <w:p>
+      <w:pPr>
+        <w:rPr>
+          <w:sz w:val="24"/>
+          <w:szCs w:val="24"/>
+        </w:rPr>
+      </w:pPr>
+      <w:r>
+        <w:rPr>
+          <w:sz w:val="24"/>
+          <w:szCs w:val="24"/>
+        </w:rPr>
+        <w:t xml:space="preserve">componentWillUnmount() is a lifecycle method in </w:t>
       </w:r>
       <w:r>
         <w:rPr>
@@ -18953,27 +18152,7 @@
           <w:sz w:val="24"/>
           <w:szCs w:val="24"/>
         </w:rPr>
-        <w:t xml:space="preserve">Uses of </w:t>
-      </w:r>
-      <w:proofErr w:type="gramStart"/>
-      <w:r>
-        <w:rPr>
-          <w:b/>
-          <w:bCs/>
-          <w:sz w:val="24"/>
-          <w:szCs w:val="24"/>
-        </w:rPr>
-        <w:t>componentWillUnmount(</w:t>
-      </w:r>
-      <w:proofErr w:type="gramEnd"/>
-      <w:r>
-        <w:rPr>
-          <w:b/>
-          <w:bCs/>
-          <w:sz w:val="24"/>
-          <w:szCs w:val="24"/>
-        </w:rPr>
-        <w:t>)</w:t>
+        <w:t>Uses of componentWillUnmount()</w:t>
       </w:r>
     </w:p>
     <w:p>
@@ -19227,34 +18406,16 @@
           <w:sz w:val="24"/>
           <w:szCs w:val="24"/>
         </w:rPr>
-        <w:t xml:space="preserve"> in React, we use super(props) inside the constructor to correctly initialize </w:t>
-      </w:r>
-      <w:proofErr w:type="gramStart"/>
-      <w:r>
-        <w:rPr>
-          <w:sz w:val="24"/>
-          <w:szCs w:val="24"/>
-        </w:rPr>
-        <w:t xml:space="preserve">the </w:t>
-      </w:r>
-      <w:r>
-        <w:rPr>
-          <w:b/>
-          <w:bCs/>
-          <w:sz w:val="24"/>
-          <w:szCs w:val="24"/>
-        </w:rPr>
-        <w:t>this</w:t>
-      </w:r>
-      <w:proofErr w:type="gramEnd"/>
-      <w:r>
-        <w:rPr>
-          <w:b/>
-          <w:bCs/>
-          <w:sz w:val="24"/>
-          <w:szCs w:val="24"/>
-        </w:rPr>
-        <w:t xml:space="preserve"> keyword</w:t>
+        <w:t xml:space="preserve"> in React, we use super(props) inside the constructor to correctly initialize the </w:t>
+      </w:r>
+      <w:r>
+        <w:rPr>
+          <w:b/>
+          <w:bCs/>
+          <w:sz w:val="24"/>
+          <w:szCs w:val="24"/>
+        </w:rPr>
+        <w:t>this keyword</w:t>
       </w:r>
       <w:r>
         <w:rPr>
@@ -19277,7 +18438,7 @@
           <w:szCs w:val="24"/>
         </w:rPr>
         <w:pict w14:anchorId="5F1747D0">
-          <v:rect id="_x0000_i1041" style="width:0;height:1.5pt" o:hralign="center" o:hrstd="t" o:hr="t" fillcolor="#a0a0a0" stroked="f"/>
+          <v:rect id="_x0000_i1035" style="width:0;height:1.5pt" o:hralign="center" o:hrstd="t" o:hr="t" fillcolor="#a0a0a0" stroked="f"/>
         </w:pict>
       </w:r>
     </w:p>
@@ -19356,23 +18517,7 @@
           <w:sz w:val="24"/>
           <w:szCs w:val="24"/>
         </w:rPr>
-        <w:t xml:space="preserve">In JavaScript, when a class extends another class, we must call </w:t>
-      </w:r>
-      <w:proofErr w:type="gramStart"/>
-      <w:r>
-        <w:rPr>
-          <w:sz w:val="24"/>
-          <w:szCs w:val="24"/>
-        </w:rPr>
-        <w:t>super(</w:t>
-      </w:r>
-      <w:proofErr w:type="gramEnd"/>
-      <w:r>
-        <w:rPr>
-          <w:sz w:val="24"/>
-          <w:szCs w:val="24"/>
-        </w:rPr>
-        <w:t>) before using this.</w:t>
+        <w:t>In JavaScript, when a class extends another class, we must call super() before using this.</w:t>
       </w:r>
     </w:p>
     <w:p>
@@ -19415,7 +18560,6 @@
         <w:t xml:space="preserve">To Allow Access to </w:t>
       </w:r>
       <w:proofErr w:type="spellStart"/>
-      <w:proofErr w:type="gramStart"/>
       <w:r>
         <w:rPr>
           <w:b/>
@@ -19426,7 +18570,6 @@
         <w:t>this.props</w:t>
       </w:r>
       <w:proofErr w:type="spellEnd"/>
-      <w:proofErr w:type="gramEnd"/>
       <w:r>
         <w:rPr>
           <w:b/>
@@ -19456,7 +18599,6 @@
         <w:t xml:space="preserve">Without super(props), </w:t>
       </w:r>
       <w:proofErr w:type="spellStart"/>
-      <w:proofErr w:type="gramStart"/>
       <w:r>
         <w:rPr>
           <w:sz w:val="24"/>
@@ -19465,7 +18607,6 @@
         <w:t>this.props</w:t>
       </w:r>
       <w:proofErr w:type="spellEnd"/>
-      <w:proofErr w:type="gramEnd"/>
       <w:r>
         <w:rPr>
           <w:sz w:val="24"/>
@@ -27585,6 +26726,7 @@
   <w:style w:type="character" w:default="1" w:styleId="DefaultParagraphFont">
     <w:name w:val="Default Paragraph Font"/>
     <w:uiPriority w:val="1"/>
+    <w:semiHidden/>
     <w:unhideWhenUsed/>
   </w:style>
   <w:style w:type="table" w:default="1" w:styleId="TableNormal">

</xml_diff>